<commit_message>
PR_1 is finished now
</commit_message>
<xml_diff>
--- a/Semester_2/Vennilay/Informatics/PR_1/Reports/Практическая работа № 6.docx
+++ b/Semester_2/Vennilay/Informatics/PR_1/Reports/Практическая работа № 6.docx
@@ -325,6 +325,15 @@
           <w:lang w:eastAsia="ru-RU"/>
           <w14:ligatures w14:val="none"/>
         </w:rPr>
+      </w:r>
+      <w:r>
+        <w:rPr>
+          <w:rFonts w:ascii="Calibri" w:hAnsi="Calibri" w:eastAsia="Calibri" w:cs="Calibri"/>
+          <w:b/>
+          <w:szCs w:val="24"/>
+          <w:lang w:eastAsia="ru-RU"/>
+          <w14:ligatures w14:val="none"/>
+        </w:rPr>
         <mc:AlternateContent>
           <mc:Choice Requires="wpg">
             <w:drawing>
@@ -340,18 +349,18 @@
                       <wpg:grpSpPr bwMode="auto">
                         <a:xfrm>
                           <a:off x="0" y="0"/>
-                          <a:ext cx="5600662" cy="39751"/>
+                          <a:ext cx="5600661" cy="39750"/>
                           <a:chOff x="0" y="0"/>
-                          <a:chExt cx="5600662" cy="39751"/>
+                          <a:chExt cx="5600661" cy="39750"/>
                         </a:xfrm>
                       </wpg:grpSpPr>
                       <wps:wsp>
-                        <wps:cNvPr id="0" name=""/>
+                        <wps:cNvPr id="1891074322" name=""/>
                         <wps:cNvSpPr/>
                         <wps:spPr bwMode="auto">
                           <a:xfrm>
-                            <a:off x="13" y="25400"/>
-                            <a:ext cx="5600649" cy="14351"/>
+                            <a:off x="12" y="25399"/>
+                            <a:ext cx="5600648" cy="14350"/>
                           </a:xfrm>
                           <a:custGeom>
                             <a:avLst/>
@@ -397,12 +406,12 @@
                         </wps:bodyPr>
                       </wps:wsp>
                       <wps:wsp>
-                        <wps:cNvPr id="1" name=""/>
+                        <wps:cNvPr id="1231752759" name=""/>
                         <wps:cNvSpPr/>
                         <wps:spPr bwMode="auto">
                           <a:xfrm>
                             <a:off x="0" y="0"/>
-                            <a:ext cx="5600662" cy="14351"/>
+                            <a:ext cx="5600661" cy="14350"/>
                           </a:xfrm>
                           <a:custGeom>
                             <a:avLst/>
@@ -456,7 +465,7 @@
           <mc:Fallback>
             <w:pict>
               <v:group id="group 1" o:spid="_x0000_s0000" style="width:441.00pt;height:3.13pt;mso-wrap-distance-left:0.00pt;mso-wrap-distance-top:0.00pt;mso-wrap-distance-right:0.00pt;mso-wrap-distance-bottom:0.00pt;" coordorigin="0,0" coordsize="56006,397">
-                <v:shape id="shape 2" o:spid="_x0000_s2" style="position:absolute;left:0;top:254;width:56006;height:143;visibility:visible;" path="m100000,0l100000,88495l0,100000l0,11502l100000,0xe" coordsize="100000,100000" fillcolor="#000000" stroked="f" strokeweight="0.00pt">
+                <v:shape id="shape 2" o:spid="_x0000_s2" style="position:absolute;left:0;top:253;width:56006;height:143;visibility:visible;" path="m100000,0l100000,88495l0,100000l0,11502l100000,0xe" coordsize="100000,100000" fillcolor="#000000" stroked="f" strokeweight="0.00pt">
                   <v:path textboxrect="0,0,0,0"/>
                 </v:shape>
                 <v:shape id="shape 3" o:spid="_x0000_s3" style="position:absolute;left:0;top:0;width:56006;height:143;visibility:visible;" path="m100000,0l100000,88495l0,100000l0,11502l100000,0xe" coordsize="100000,100000" fillcolor="#000000" stroked="f" strokeweight="0.00pt">
@@ -466,6 +475,15 @@
             </w:pict>
           </mc:Fallback>
         </mc:AlternateContent>
+      </w:r>
+      <w:r>
+        <w:rPr>
+          <w:rFonts w:ascii="Calibri" w:hAnsi="Calibri" w:eastAsia="Calibri" w:cs="Calibri"/>
+          <w:b/>
+          <w:szCs w:val="24"/>
+          <w:lang w:eastAsia="ru-RU"/>
+          <w14:ligatures w14:val="none"/>
+        </w:rPr>
       </w:r>
       <w:bookmarkEnd w:id="1"/>
       <w:r/>
@@ -3226,14 +3244,1898 @@
         <w:jc w:val="left"/>
         <w:rPr>
           <w:rFonts w:ascii="Times New Roman" w:hAnsi="Times New Roman" w:eastAsia="Times New Roman" w:cs="Times New Roman"/>
+          <w:b/>
+          <w:bCs/>
           <w:color w:val="000000"/>
-          <w:sz w:val="32"/>
-          <w:szCs w:val="32"/>
+          <w:sz w:val="28"/>
+          <w:szCs w:val="28"/>
+          <w:highlight w:val="none"/>
+          <w14:ligatures w14:val="none"/>
+        </w:rPr>
+      </w:pPr>
+      <w:r>
+        <w:rPr>
+          <w:rFonts w:ascii="Times New Roman" w:hAnsi="Times New Roman" w:eastAsia="Times New Roman" w:cs="Times New Roman"/>
+          <w:b/>
+          <w:bCs/>
+          <w:color w:val="000000"/>
+          <w:sz w:val="28"/>
+          <w:szCs w:val="28"/>
           <w:highlight w:val="none"/>
           <w:lang w:val="en-US"/>
           <w14:ligatures w14:val="none"/>
         </w:rPr>
-      </w:pPr>
+      </w:r>
+      <w:r>
+        <w:rPr>
+          <w:rFonts w:ascii="Times New Roman" w:hAnsi="Times New Roman" w:eastAsia="Times New Roman" w:cs="Times New Roman"/>
+          <w:b/>
+          <w:bCs/>
+          <w:color w:val="000000"/>
+          <w:sz w:val="28"/>
+          <w:szCs w:val="28"/>
+          <w:highlight w:val="none"/>
+          <w:lang w:val="en-US"/>
+          <w14:ligatures w14:val="none"/>
+        </w:rPr>
+        <w:t xml:space="preserve">1. Восстановление таблицы истинности</w:t>
+      </w:r>
+      <w:r>
+        <w:rPr>
+          <w:rFonts w:ascii="Times New Roman" w:hAnsi="Times New Roman" w:eastAsia="Times New Roman" w:cs="Times New Roman"/>
+          <w:b/>
+          <w:bCs/>
+          <w:color w:val="000000"/>
+          <w:sz w:val="28"/>
+          <w:szCs w:val="28"/>
+          <w:highlight w:val="none"/>
+          <w:lang w:val="en-US"/>
+          <w14:ligatures w14:val="none"/>
+        </w:rPr>
+        <w:t xml:space="preserve">:</w:t>
+      </w:r>
+      <w:r>
+        <w:rPr>
+          <w:rFonts w:ascii="Times New Roman" w:hAnsi="Times New Roman" w:eastAsia="Times New Roman" w:cs="Times New Roman"/>
+          <w:b/>
+          <w:bCs/>
+          <w:color w:val="000000"/>
+          <w:sz w:val="28"/>
+          <w:szCs w:val="28"/>
+          <w:highlight w:val="none"/>
+          <w:lang w:val="en-US"/>
+          <w14:ligatures w14:val="none"/>
+        </w:rPr>
+      </w:r>
+      <w:r>
+        <w:rPr>
+          <w:rFonts w:ascii="Times New Roman" w:hAnsi="Times New Roman" w:eastAsia="Times New Roman" w:cs="Times New Roman"/>
+          <w:b/>
+          <w:bCs/>
+          <w:color w:val="000000"/>
+          <w:sz w:val="28"/>
+          <w:szCs w:val="28"/>
+          <w:highlight w:val="none"/>
+          <w:lang w:val="en-US"/>
+          <w14:ligatures w14:val="none"/>
+        </w:rPr>
+      </w:r>
+    </w:p>
+    <w:p>
+      <w:pPr>
+        <w:pBdr/>
+        <w:spacing w:after="14" w:line="240" w:lineRule="auto"/>
+        <w:ind w:right="270" w:firstLine="0" w:left="0"/>
+        <w:jc w:val="left"/>
+        <w:rPr>
+          <w:rFonts w:ascii="Times New Roman" w:hAnsi="Times New Roman" w:eastAsia="Times New Roman" w:cs="Times New Roman"/>
+          <w:color w:val="000000"/>
+          <w:sz w:val="28"/>
+          <w:szCs w:val="28"/>
+          <w:highlight w:val="none"/>
+        </w:rPr>
+      </w:pPr>
+      <w:r>
+        <w:rPr>
+          <w:rFonts w:ascii="Times New Roman" w:hAnsi="Times New Roman" w:eastAsia="Times New Roman" w:cs="Times New Roman"/>
+          <w:color w:val="000000"/>
+          <w:sz w:val="28"/>
+          <w:szCs w:val="28"/>
+          <w14:ligatures w14:val="none"/>
+        </w:rPr>
+        <w:t xml:space="preserve">Двоичная запись представляет собой столбец значений функции для всех 16 комбинаций входных переменных (от </w:t>
+      </w:r>
+      <w:r/>
+      <w:r>
+        <w:rPr>
+          <w:rFonts w:ascii="Times New Roman" w:hAnsi="Times New Roman" w:eastAsia="Times New Roman" w:cs="Times New Roman"/>
+          <w:color w:val="000000"/>
+          <w:sz w:val="28"/>
+          <w:szCs w:val="28"/>
+          <w14:ligatures w14:val="none"/>
+        </w:rPr>
+        <w:t xml:space="preserve">0000 </w:t>
+      </w:r>
+      <w:r/>
+      <w:r>
+        <w:rPr>
+          <w:rFonts w:ascii="Times New Roman" w:hAnsi="Times New Roman" w:eastAsia="Times New Roman" w:cs="Times New Roman"/>
+          <w:color w:val="000000"/>
+          <w:sz w:val="28"/>
+          <w:szCs w:val="28"/>
+          <w14:ligatures w14:val="none"/>
+        </w:rPr>
+      </w:r>
+      <w:r>
+        <w:rPr>
+          <w:rFonts w:ascii="Times New Roman" w:hAnsi="Times New Roman" w:eastAsia="Times New Roman" w:cs="Times New Roman"/>
+          <w:color w:val="000000"/>
+          <w:sz w:val="28"/>
+          <w:szCs w:val="28"/>
+          <w14:ligatures w14:val="none"/>
+        </w:rPr>
+        <w:t xml:space="preserve">до </w:t>
+      </w:r>
+      <w:r>
+        <w:rPr>
+          <w:rFonts w:ascii="Times New Roman" w:hAnsi="Times New Roman" w:eastAsia="Times New Roman" w:cs="Times New Roman"/>
+          <w:color w:val="000000"/>
+          <w:sz w:val="28"/>
+          <w:szCs w:val="28"/>
+          <w14:ligatures w14:val="none"/>
+        </w:rPr>
+        <w:t xml:space="preserve">1111)</w:t>
+      </w:r>
+      <w:r>
+        <w:rPr>
+          <w:rFonts w:ascii="Times New Roman" w:hAnsi="Times New Roman" w:eastAsia="Times New Roman" w:cs="Times New Roman"/>
+          <w:color w:val="000000"/>
+          <w:sz w:val="28"/>
+          <w:szCs w:val="28"/>
+          <w:highlight w:val="none"/>
+          <w14:ligatures w14:val="none"/>
+        </w:rPr>
+      </w:r>
+      <w:r>
+        <w:rPr>
+          <w:rFonts w:ascii="Times New Roman" w:hAnsi="Times New Roman" w:eastAsia="Times New Roman" w:cs="Times New Roman"/>
+          <w:color w:val="000000"/>
+          <w:sz w:val="28"/>
+          <w:szCs w:val="28"/>
+          <w:highlight w:val="none"/>
+          <w14:ligatures w14:val="none"/>
+        </w:rPr>
+      </w:r>
+      <w:r>
+        <w:rPr>
+          <w:rFonts w:ascii="Times New Roman" w:hAnsi="Times New Roman" w:eastAsia="Times New Roman" w:cs="Times New Roman"/>
+          <w:color w:val="000000"/>
+          <w:sz w:val="28"/>
+          <w:szCs w:val="28"/>
+          <w:highlight w:val="none"/>
+          <w14:ligatures w14:val="none"/>
+        </w:rPr>
+      </w:r>
+      <w:r>
+        <w:rPr>
+          <w:rFonts w:ascii="Times New Roman" w:hAnsi="Times New Roman" w:eastAsia="Times New Roman" w:cs="Times New Roman"/>
+          <w:color w:val="000000"/>
+          <w:sz w:val="28"/>
+          <w:szCs w:val="28"/>
+          <w:highlight w:val="none"/>
+          <w14:ligatures w14:val="none"/>
+        </w:rPr>
+      </w:r>
+    </w:p>
+    <w:p>
+      <w:pPr>
+        <w:pBdr/>
+        <w:spacing w:after="14" w:line="240" w:lineRule="auto"/>
+        <w:ind w:right="270" w:firstLine="0" w:left="0"/>
+        <w:jc w:val="left"/>
+        <w:rPr>
+          <w:rFonts w:ascii="Times New Roman" w:hAnsi="Times New Roman" w:eastAsia="Times New Roman" w:cs="Times New Roman"/>
+          <w:color w:val="000000"/>
+          <w:sz w:val="28"/>
+          <w:szCs w:val="28"/>
+          <w:highlight w:val="none"/>
+        </w:rPr>
+      </w:pPr>
+      <w:r>
+        <w:rPr>
+          <w:rFonts w:ascii="Times New Roman" w:hAnsi="Times New Roman" w:eastAsia="Times New Roman" w:cs="Times New Roman"/>
+          <w:color w:val="000000"/>
+          <w:sz w:val="28"/>
+          <w:szCs w:val="28"/>
+          <w:highlight w:val="none"/>
+          <w14:ligatures w14:val="none"/>
+        </w:rPr>
+      </w:r>
+      <w:r/>
+      <w:r>
+        <mc:AlternateContent>
+          <mc:Choice Requires="wpg">
+            <w:drawing>
+              <wp:inline xmlns:wp="http://schemas.openxmlformats.org/drawingml/2006/wordprocessingDrawing" distT="0" distB="0" distL="0" distR="0">
+                <wp:extent cx="3930888" cy="3466560"/>
+                <wp:effectExtent l="0" t="0" r="0" b="0"/>
+                <wp:docPr id="3" name=""/>
+                <wp:cNvGraphicFramePr>
+                  <a:graphicFrameLocks xmlns:a="http://schemas.openxmlformats.org/drawingml/2006/main" noChangeAspect="1"/>
+                </wp:cNvGraphicFramePr>
+                <a:graphic xmlns:a="http://schemas.openxmlformats.org/drawingml/2006/main">
+                  <a:graphicData uri="http://schemas.openxmlformats.org/drawingml/2006/picture">
+                    <pic:pic xmlns:pic="http://schemas.openxmlformats.org/drawingml/2006/picture">
+                      <pic:nvPicPr>
+                        <pic:cNvPr id="801040418" name=""/>
+                        <pic:cNvPicPr>
+                          <a:picLocks noChangeAspect="1"/>
+                        </pic:cNvPicPr>
+                        <pic:nvPr/>
+                      </pic:nvPicPr>
+                      <pic:blipFill rotWithShape="1">
+                        <a:blip r:embed="rId12"/>
+                        <a:stretch/>
+                      </pic:blipFill>
+                      <pic:spPr bwMode="auto">
+                        <a:xfrm flipH="0" flipV="0">
+                          <a:off x="0" y="0"/>
+                          <a:ext cx="3930887" cy="3466559"/>
+                        </a:xfrm>
+                        <a:prstGeom prst="rect">
+                          <a:avLst/>
+                        </a:prstGeom>
+                      </pic:spPr>
+                    </pic:pic>
+                  </a:graphicData>
+                </a:graphic>
+              </wp:inline>
+            </w:drawing>
+          </mc:Choice>
+          <mc:Fallback>
+            <w:pict>
+              <v:shapetype id="_x0000_t75" coordsize="21600,21600" o:spt="75" o:preferrelative="t" path="m@4@5l@4@11@9@11@9@5xe" filled="f" stroked="f">
+                <v:stroke joinstyle="miter"/>
+                <v:formulas>
+                  <v:f eqn="if lineDrawn pixelLineWidth 0"/>
+                  <v:f eqn="sum @0 1 0"/>
+                  <v:f eqn="sum 0 0 @1"/>
+                  <v:f eqn="prod @2 1 2"/>
+                  <v:f eqn="prod @3 21600 pixelWidth"/>
+                  <v:f eqn="prod @3 21600 pixelHeight"/>
+                  <v:f eqn="sum @0 0 1"/>
+                  <v:f eqn="prod @6 1 2"/>
+                  <v:f eqn="prod @7 21600 pixelWidth"/>
+                  <v:f eqn="sum @8 21600 0"/>
+                  <v:f eqn="prod @7 21600 pixelHeight"/>
+                  <v:f eqn="sum @10 21600 0"/>
+                </v:formulas>
+                <v:path o:extrusionok="f" gradientshapeok="t" o:connecttype="rect"/>
+                <o:lock v:ext="edit" aspectratio="t"/>
+              </v:shapetype>
+              <v:shape id="_x0000_i4" o:spid="_x0000_s4" type="#_x0000_t75" style="width:309.52pt;height:272.96pt;mso-wrap-distance-left:0.00pt;mso-wrap-distance-top:0.00pt;mso-wrap-distance-right:0.00pt;mso-wrap-distance-bottom:0.00pt;z-index:1;" stroked="false">
+                <v:imagedata r:id="rId12" o:title=""/>
+                <o:lock v:ext="edit" rotation="t"/>
+              </v:shape>
+            </w:pict>
+          </mc:Fallback>
+        </mc:AlternateContent>
+      </w:r>
+      <w:r/>
+      <w:r>
+        <w:rPr>
+          <w:rFonts w:ascii="Times New Roman" w:hAnsi="Times New Roman" w:eastAsia="Times New Roman" w:cs="Times New Roman"/>
+          <w:color w:val="000000"/>
+          <w:sz w:val="28"/>
+          <w:szCs w:val="28"/>
+          <w:highlight w:val="none"/>
+          <w14:ligatures w14:val="none"/>
+        </w:rPr>
+      </w:r>
+      <w:r>
+        <w:rPr>
+          <w:rFonts w:ascii="Times New Roman" w:hAnsi="Times New Roman" w:eastAsia="Times New Roman" w:cs="Times New Roman"/>
+          <w:color w:val="000000"/>
+          <w:sz w:val="28"/>
+          <w:szCs w:val="28"/>
+          <w:highlight w:val="none"/>
+          <w14:ligatures w14:val="none"/>
+        </w:rPr>
+        <w:br/>
+        <w:br/>
+      </w:r>
+      <w:r>
+        <w:rPr>
+          <w:rFonts w:ascii="Times New Roman" w:hAnsi="Times New Roman" w:eastAsia="Times New Roman" w:cs="Times New Roman"/>
+          <w:color w:val="000000"/>
+          <w:sz w:val="28"/>
+          <w:szCs w:val="28"/>
+          <w:highlight w:val="none"/>
+          <w14:ligatures w14:val="none"/>
+        </w:rPr>
+      </w:r>
+    </w:p>
+    <w:p>
+      <w:pPr>
+        <w:pBdr/>
+        <w:spacing w:after="14" w:line="240" w:lineRule="auto"/>
+        <w:ind w:right="270" w:firstLine="0" w:left="0"/>
+        <w:jc w:val="left"/>
+        <w:rPr>
+          <w:rFonts w:ascii="Times New Roman" w:hAnsi="Times New Roman" w:cs="Times New Roman"/>
+          <w:color w:val="000000"/>
+          <w:sz w:val="28"/>
+          <w:szCs w:val="28"/>
+          <w:highlight w:val="none"/>
+          <w14:ligatures w14:val="none"/>
+        </w:rPr>
+      </w:pPr>
+      <w:r>
+        <w:rPr>
+          <w:rFonts w:ascii="Times New Roman" w:hAnsi="Times New Roman" w:eastAsia="Times New Roman" w:cs="Times New Roman"/>
+          <w:color w:val="000000"/>
+          <w:sz w:val="28"/>
+          <w:szCs w:val="28"/>
+          <w:highlight w:val="none"/>
+          <w14:ligatures w14:val="none"/>
+        </w:rPr>
+      </w:r>
+      <w:r>
+        <w:rPr>
+          <w:rFonts w:ascii="Times New Roman" w:hAnsi="Times New Roman" w:eastAsia="Times New Roman" w:cs="Times New Roman"/>
+          <w:color w:val="000000"/>
+          <w:sz w:val="28"/>
+          <w:szCs w:val="28"/>
+          <w:highlight w:val="none"/>
+          <w14:ligatures w14:val="none"/>
+        </w:rPr>
+      </w:r>
+      <w:r>
+        <w:rPr>
+          <w:rFonts w:ascii="Times New Roman" w:hAnsi="Times New Roman" w:eastAsia="Times New Roman" w:cs="Times New Roman"/>
+          <w:color w:val="000000"/>
+          <w:sz w:val="28"/>
+          <w:szCs w:val="28"/>
+          <w:highlight w:val="none"/>
+          <w14:ligatures w14:val="none"/>
+        </w:rPr>
+      </w:r>
+    </w:p>
+    <w:p>
+      <w:pPr>
+        <w:pBdr/>
+        <w:spacing w:after="14" w:line="240" w:lineRule="auto"/>
+        <w:ind w:right="270" w:firstLine="0" w:left="0"/>
+        <w:jc w:val="left"/>
+        <w:rPr>
+          <w:rFonts w:ascii="Times New Roman" w:hAnsi="Times New Roman" w:eastAsia="Times New Roman" w:cs="Times New Roman"/>
+          <w:b/>
+          <w:bCs/>
+          <w:color w:val="000000"/>
+          <w:sz w:val="28"/>
+          <w:szCs w:val="28"/>
+          <w:highlight w:val="none"/>
+          <w14:ligatures w14:val="none"/>
+        </w:rPr>
+      </w:pPr>
+      <w:r>
+        <w:rPr>
+          <w:rFonts w:ascii="Times New Roman" w:hAnsi="Times New Roman" w:eastAsia="Times New Roman" w:cs="Times New Roman"/>
+          <w:b/>
+          <w:bCs/>
+          <w:color w:val="000000"/>
+          <w:sz w:val="28"/>
+          <w:szCs w:val="28"/>
+          <w:highlight w:val="none"/>
+          <w14:ligatures w14:val="none"/>
+        </w:rPr>
+      </w:r>
+      <w:r>
+        <w:rPr>
+          <w:rFonts w:ascii="Times New Roman" w:hAnsi="Times New Roman" w:eastAsia="Times New Roman" w:cs="Times New Roman"/>
+          <w:b/>
+          <w:bCs/>
+          <w:color w:val="000000"/>
+          <w:sz w:val="28"/>
+          <w:szCs w:val="28"/>
+          <w:highlight w:val="none"/>
+          <w14:ligatures w14:val="none"/>
+        </w:rPr>
+      </w:r>
+      <w:r>
+        <w:rPr>
+          <w:rFonts w:ascii="Times New Roman" w:hAnsi="Times New Roman" w:eastAsia="Times New Roman" w:cs="Times New Roman"/>
+          <w:b/>
+          <w:bCs/>
+          <w:color w:val="000000"/>
+          <w:sz w:val="28"/>
+          <w:szCs w:val="28"/>
+          <w:highlight w:val="none"/>
+          <w14:ligatures w14:val="none"/>
+        </w:rPr>
+      </w:r>
+    </w:p>
+    <w:p>
+      <w:pPr>
+        <w:pBdr/>
+        <w:spacing w:after="14" w:line="240" w:lineRule="auto"/>
+        <w:ind w:right="270" w:firstLine="0" w:left="0"/>
+        <w:jc w:val="left"/>
+        <w:rPr>
+          <w:rFonts w:ascii="Times New Roman" w:hAnsi="Times New Roman" w:eastAsia="Times New Roman" w:cs="Times New Roman"/>
+          <w:b/>
+          <w:bCs/>
+          <w:color w:val="000000"/>
+          <w:sz w:val="28"/>
+          <w:szCs w:val="28"/>
+          <w:highlight w:val="none"/>
+        </w:rPr>
+      </w:pPr>
+      <w:r>
+        <w:rPr>
+          <w:rFonts w:ascii="Times New Roman" w:hAnsi="Times New Roman" w:eastAsia="Times New Roman" w:cs="Times New Roman"/>
+          <w:b/>
+          <w:bCs/>
+          <w:color w:val="000000"/>
+          <w:sz w:val="28"/>
+          <w:szCs w:val="28"/>
+          <w:highlight w:val="none"/>
+          <w14:ligatures w14:val="none"/>
+        </w:rPr>
+        <w:t xml:space="preserve">Построение СДНФ</w:t>
+      </w:r>
+      <w:r>
+        <w:rPr>
+          <w:b/>
+          <w:bCs/>
+        </w:rPr>
+      </w:r>
+    </w:p>
+    <w:p>
+      <w:pPr>
+        <w:pBdr/>
+        <w:spacing w:after="14" w:line="240" w:lineRule="auto"/>
+        <w:ind w:right="270" w:firstLine="0" w:left="0"/>
+        <w:jc w:val="left"/>
+        <w:rPr>
+          <w:rFonts w:ascii="Times New Roman" w:hAnsi="Times New Roman" w:eastAsia="Times New Roman" w:cs="Times New Roman"/>
+          <w:color w:val="000000"/>
+          <w:sz w:val="28"/>
+          <w:szCs w:val="28"/>
+          <w:highlight w:val="none"/>
+          <w14:ligatures w14:val="none"/>
+        </w:rPr>
+      </w:pPr>
+      <w:r>
+        <w:rPr>
+          <w:rFonts w:ascii="Times New Roman" w:hAnsi="Times New Roman" w:eastAsia="Times New Roman" w:cs="Times New Roman"/>
+          <w:color w:val="000000"/>
+          <w:sz w:val="28"/>
+          <w:szCs w:val="28"/>
+          <w:highlight w:val="none"/>
+          <w14:ligatures w14:val="none"/>
+        </w:rPr>
+        <w:t xml:space="preserve">Совершенная дизъюнктивная нормальная форма (СДНФ) строится для строк, где функция принимает значение </w:t>
+      </w:r>
+      <w:r/>
+      <w:r>
+        <w:rPr>
+          <w:rFonts w:ascii="Times New Roman" w:hAnsi="Times New Roman" w:eastAsia="Times New Roman" w:cs="Times New Roman"/>
+          <w:color w:val="000000"/>
+          <w:sz w:val="28"/>
+          <w:szCs w:val="28"/>
+          <w:highlight w:val="none"/>
+          <w14:ligatures w14:val="none"/>
+        </w:rPr>
+        <w:t xml:space="preserve">1</w:t>
+      </w:r>
+      <w:r>
+        <w:rPr>
+          <w:rFonts w:ascii="Times New Roman" w:hAnsi="Times New Roman" w:eastAsia="Times New Roman" w:cs="Times New Roman"/>
+          <w:color w:val="000000"/>
+          <w:sz w:val="28"/>
+          <w:szCs w:val="28"/>
+          <w:highlight w:val="none"/>
+          <w14:ligatures w14:val="none"/>
+        </w:rPr>
+      </w:r>
+    </w:p>
+    <w:p>
+      <w:pPr>
+        <w:pBdr/>
+        <w:spacing w:after="14" w:line="240" w:lineRule="auto"/>
+        <w:ind w:right="270" w:firstLine="0" w:left="0"/>
+        <w:jc w:val="left"/>
+        <w:rPr>
+          <w:rFonts w:ascii="Times New Roman" w:hAnsi="Times New Roman" w:eastAsia="Times New Roman" w:cs="Times New Roman"/>
+          <w:color w:val="000000"/>
+          <w:sz w:val="28"/>
+          <w:szCs w:val="28"/>
+          <w:highlight w:val="none"/>
+          <w14:ligatures w14:val="none"/>
+        </w:rPr>
+      </w:pPr>
+      <w:r>
+        <w:rPr>
+          <w:rFonts w:ascii="Times New Roman" w:hAnsi="Times New Roman" w:eastAsia="Times New Roman" w:cs="Times New Roman"/>
+          <w:color w:val="000000"/>
+          <w:sz w:val="28"/>
+          <w:szCs w:val="28"/>
+          <w:highlight w:val="none"/>
+          <w14:ligatures w14:val="none"/>
+        </w:rPr>
+      </w:r>
+      <w:r>
+        <w:rPr>
+          <w:rFonts w:ascii="Times New Roman" w:hAnsi="Times New Roman" w:eastAsia="Times New Roman" w:cs="Times New Roman"/>
+          <w:color w:val="000000"/>
+          <w:sz w:val="28"/>
+          <w:szCs w:val="28"/>
+          <w:highlight w:val="none"/>
+          <w14:ligatures w14:val="none"/>
+        </w:rPr>
+      </w:r>
+      <w:r>
+        <w:rPr>
+          <w:rFonts w:ascii="Times New Roman" w:hAnsi="Times New Roman" w:eastAsia="Times New Roman" w:cs="Times New Roman"/>
+          <w:color w:val="000000"/>
+          <w:sz w:val="28"/>
+          <w:szCs w:val="28"/>
+          <w:highlight w:val="none"/>
+          <w14:ligatures w14:val="none"/>
+        </w:rPr>
+      </w:r>
+    </w:p>
+    <w:p>
+      <w:pPr>
+        <w:pBdr/>
+        <w:spacing w:after="14" w:line="240" w:lineRule="auto"/>
+        <w:ind w:right="270" w:firstLine="0" w:left="0"/>
+        <w:jc w:val="left"/>
+        <w:rPr>
+          <w:rFonts w:ascii="Times New Roman" w:hAnsi="Times New Roman" w:eastAsia="Times New Roman" w:cs="Times New Roman"/>
+          <w:b/>
+          <w:bCs/>
+          <w:color w:val="000000"/>
+          <w:sz w:val="28"/>
+          <w:szCs w:val="28"/>
+          <w:highlight w:val="none"/>
+          <w14:ligatures w14:val="none"/>
+        </w:rPr>
+      </w:pPr>
+      <w:r>
+        <w:rPr>
+          <w:rFonts w:ascii="Times New Roman" w:hAnsi="Times New Roman" w:eastAsia="Times New Roman" w:cs="Times New Roman"/>
+          <w:b/>
+          <w:bCs/>
+          <w:color w:val="000000"/>
+          <w:sz w:val="28"/>
+          <w:szCs w:val="28"/>
+          <w:highlight w:val="none"/>
+          <w14:ligatures w14:val="none"/>
+        </w:rPr>
+      </w:r>
+      <w:r>
+        <w:rPr>
+          <w:rFonts w:ascii="Times New Roman" w:hAnsi="Times New Roman" w:eastAsia="Times New Roman" w:cs="Times New Roman"/>
+          <w:b/>
+          <w:bCs/>
+          <w:color w:val="000000"/>
+          <w:sz w:val="28"/>
+          <w:szCs w:val="28"/>
+          <w:highlight w:val="none"/>
+          <w14:ligatures w14:val="none"/>
+        </w:rPr>
+        <w:t xml:space="preserve">Функция равна 1 в следующих строках:</w:t>
+      </w:r>
+      <w:r>
+        <w:rPr>
+          <w:rFonts w:ascii="Times New Roman" w:hAnsi="Times New Roman" w:eastAsia="Times New Roman" w:cs="Times New Roman"/>
+          <w:b/>
+          <w:bCs/>
+        </w:rPr>
+      </w:r>
+      <w:r>
+        <w:rPr>
+          <w:rFonts w:ascii="Times New Roman" w:hAnsi="Times New Roman" w:eastAsia="Times New Roman" w:cs="Times New Roman"/>
+          <w:b/>
+          <w:bCs/>
+        </w:rPr>
+      </w:r>
+      <w:r>
+        <w:rPr>
+          <w:rFonts w:ascii="Times New Roman" w:hAnsi="Times New Roman" w:eastAsia="Times New Roman" w:cs="Times New Roman"/>
+          <w:color w:val="000000"/>
+          <w:sz w:val="28"/>
+          <w:szCs w:val="28"/>
+          <w:highlight w:val="none"/>
+          <w14:ligatures w14:val="none"/>
+        </w:rPr>
+      </w:r>
+      <w:r>
+        <w:rPr>
+          <w:rFonts w:ascii="Times New Roman" w:hAnsi="Times New Roman" w:eastAsia="Times New Roman" w:cs="Times New Roman"/>
+        </w:rPr>
+      </w:r>
+      <w:r>
+        <w:rPr>
+          <w:rFonts w:ascii="Times New Roman" w:hAnsi="Times New Roman" w:eastAsia="Times New Roman" w:cs="Times New Roman"/>
+          <w:b/>
+          <w:bCs/>
+          <w:color w:val="000000"/>
+          <w:sz w:val="28"/>
+          <w:szCs w:val="28"/>
+          <w:highlight w:val="none"/>
+          <w14:ligatures w14:val="none"/>
+        </w:rPr>
+      </w:r>
+    </w:p>
+    <w:p>
+      <w:pPr>
+        <w:pStyle w:val="957"/>
+        <w:numPr>
+          <w:ilvl w:val="0"/>
+          <w:numId w:val="19"/>
+        </w:numPr>
+        <w:pBdr/>
+        <w:spacing w:after="14" w:line="240" w:lineRule="auto"/>
+        <w:ind w:right="270"/>
+        <w:jc w:val="left"/>
+        <w:rPr>
+          <w:rFonts w:ascii="Times New Roman" w:hAnsi="Times New Roman" w:cs="Times New Roman"/>
+        </w:rPr>
+      </w:pPr>
+      <w:r>
+        <w:rPr>
+          <w:rFonts w:ascii="Times New Roman" w:hAnsi="Times New Roman" w:eastAsia="Times New Roman" w:cs="Times New Roman"/>
+          <w:color w:val="000000"/>
+          <w:sz w:val="28"/>
+          <w:szCs w:val="28"/>
+          <w:highlight w:val="none"/>
+          <w14:ligatures w14:val="none"/>
+        </w:rPr>
+        <w:t xml:space="preserve">Строка 0: (a = 0, b = 0, c = 0, d = 0) → НЕ a И НЕ b И НЕ c И НЕ d</w:t>
+      </w:r>
+      <w:r>
+        <w:rPr>
+          <w:rFonts w:ascii="Times New Roman" w:hAnsi="Times New Roman" w:eastAsia="Times New Roman" w:cs="Times New Roman"/>
+        </w:rPr>
+      </w:r>
+    </w:p>
+    <w:p>
+      <w:pPr>
+        <w:pStyle w:val="957"/>
+        <w:numPr>
+          <w:ilvl w:val="0"/>
+          <w:numId w:val="19"/>
+        </w:numPr>
+        <w:pBdr/>
+        <w:spacing w:after="14" w:line="240" w:lineRule="auto"/>
+        <w:ind w:right="270"/>
+        <w:jc w:val="left"/>
+        <w:rPr>
+          <w:rFonts w:ascii="Times New Roman" w:hAnsi="Times New Roman" w:cs="Times New Roman"/>
+        </w:rPr>
+      </w:pPr>
+      <w:r>
+        <w:rPr>
+          <w:rFonts w:ascii="Times New Roman" w:hAnsi="Times New Roman" w:eastAsia="Times New Roman" w:cs="Times New Roman"/>
+          <w:color w:val="000000"/>
+          <w:sz w:val="28"/>
+          <w:szCs w:val="28"/>
+          <w:highlight w:val="none"/>
+          <w14:ligatures w14:val="none"/>
+        </w:rPr>
+        <w:t xml:space="preserve">Строка 2: (a = 0, b = 0, c = 1, d = 0) → НЕ a И НЕ b И c И НЕ d</w:t>
+      </w:r>
+      <w:r>
+        <w:rPr>
+          <w:rFonts w:ascii="Times New Roman" w:hAnsi="Times New Roman" w:eastAsia="Times New Roman" w:cs="Times New Roman"/>
+        </w:rPr>
+      </w:r>
+    </w:p>
+    <w:p>
+      <w:pPr>
+        <w:pStyle w:val="957"/>
+        <w:numPr>
+          <w:ilvl w:val="0"/>
+          <w:numId w:val="19"/>
+        </w:numPr>
+        <w:pBdr/>
+        <w:spacing w:after="14" w:line="240" w:lineRule="auto"/>
+        <w:ind w:right="270"/>
+        <w:jc w:val="left"/>
+        <w:rPr>
+          <w:rFonts w:ascii="Times New Roman" w:hAnsi="Times New Roman" w:cs="Times New Roman"/>
+        </w:rPr>
+      </w:pPr>
+      <w:r>
+        <w:rPr>
+          <w:rFonts w:ascii="Times New Roman" w:hAnsi="Times New Roman" w:eastAsia="Times New Roman" w:cs="Times New Roman"/>
+          <w:color w:val="000000"/>
+          <w:sz w:val="28"/>
+          <w:szCs w:val="28"/>
+          <w:highlight w:val="none"/>
+          <w14:ligatures w14:val="none"/>
+        </w:rPr>
+        <w:t xml:space="preserve">Строка 5: (a = 0, b = 1, c = 0, d = 1) → НЕ a И b И НЕ c И d</w:t>
+      </w:r>
+      <w:r>
+        <w:rPr>
+          <w:rFonts w:ascii="Times New Roman" w:hAnsi="Times New Roman" w:eastAsia="Times New Roman" w:cs="Times New Roman"/>
+        </w:rPr>
+      </w:r>
+    </w:p>
+    <w:p>
+      <w:pPr>
+        <w:pStyle w:val="957"/>
+        <w:numPr>
+          <w:ilvl w:val="0"/>
+          <w:numId w:val="19"/>
+        </w:numPr>
+        <w:pBdr/>
+        <w:spacing w:after="14" w:line="240" w:lineRule="auto"/>
+        <w:ind w:right="270"/>
+        <w:jc w:val="left"/>
+        <w:rPr>
+          <w:rFonts w:ascii="Times New Roman" w:hAnsi="Times New Roman" w:cs="Times New Roman"/>
+        </w:rPr>
+      </w:pPr>
+      <w:r>
+        <w:rPr>
+          <w:rFonts w:ascii="Times New Roman" w:hAnsi="Times New Roman" w:eastAsia="Times New Roman" w:cs="Times New Roman"/>
+          <w:color w:val="000000"/>
+          <w:sz w:val="28"/>
+          <w:szCs w:val="28"/>
+          <w:highlight w:val="none"/>
+          <w14:ligatures w14:val="none"/>
+        </w:rPr>
+        <w:t xml:space="preserve">Строка 6: (a = 0, b = 1, c = 1, d = 0) → НЕ a И b И c И НЕ d</w:t>
+      </w:r>
+      <w:r>
+        <w:rPr>
+          <w:rFonts w:ascii="Times New Roman" w:hAnsi="Times New Roman" w:eastAsia="Times New Roman" w:cs="Times New Roman"/>
+        </w:rPr>
+      </w:r>
+    </w:p>
+    <w:p>
+      <w:pPr>
+        <w:pStyle w:val="957"/>
+        <w:numPr>
+          <w:ilvl w:val="0"/>
+          <w:numId w:val="19"/>
+        </w:numPr>
+        <w:pBdr/>
+        <w:spacing w:after="14" w:line="240" w:lineRule="auto"/>
+        <w:ind w:right="270"/>
+        <w:jc w:val="left"/>
+        <w:rPr>
+          <w:rFonts w:ascii="Times New Roman" w:hAnsi="Times New Roman" w:cs="Times New Roman"/>
+        </w:rPr>
+      </w:pPr>
+      <w:r>
+        <w:rPr>
+          <w:rFonts w:ascii="Times New Roman" w:hAnsi="Times New Roman" w:eastAsia="Times New Roman" w:cs="Times New Roman"/>
+          <w:color w:val="000000"/>
+          <w:sz w:val="28"/>
+          <w:szCs w:val="28"/>
+          <w:highlight w:val="none"/>
+          <w14:ligatures w14:val="none"/>
+        </w:rPr>
+        <w:t xml:space="preserve">Строка 7: (a = 0, b = 1, c = 1, d = 1) → НЕ a И b И c И d</w:t>
+      </w:r>
+      <w:r>
+        <w:rPr>
+          <w:rFonts w:ascii="Times New Roman" w:hAnsi="Times New Roman" w:eastAsia="Times New Roman" w:cs="Times New Roman"/>
+        </w:rPr>
+      </w:r>
+    </w:p>
+    <w:p>
+      <w:pPr>
+        <w:pStyle w:val="957"/>
+        <w:numPr>
+          <w:ilvl w:val="0"/>
+          <w:numId w:val="19"/>
+        </w:numPr>
+        <w:pBdr/>
+        <w:spacing w:after="14" w:line="240" w:lineRule="auto"/>
+        <w:ind w:right="270"/>
+        <w:jc w:val="left"/>
+        <w:rPr>
+          <w:rFonts w:ascii="Times New Roman" w:hAnsi="Times New Roman" w:cs="Times New Roman"/>
+        </w:rPr>
+      </w:pPr>
+      <w:r>
+        <w:rPr>
+          <w:rFonts w:ascii="Times New Roman" w:hAnsi="Times New Roman" w:eastAsia="Times New Roman" w:cs="Times New Roman"/>
+          <w:color w:val="000000"/>
+          <w:sz w:val="28"/>
+          <w:szCs w:val="28"/>
+          <w:highlight w:val="none"/>
+          <w14:ligatures w14:val="none"/>
+        </w:rPr>
+        <w:t xml:space="preserve">Строка 8: (a = 1, b = 0, c = 0, d = 0) → a И НЕ b И НЕ c И НЕ d</w:t>
+      </w:r>
+      <w:r>
+        <w:rPr>
+          <w:rFonts w:ascii="Times New Roman" w:hAnsi="Times New Roman" w:eastAsia="Times New Roman" w:cs="Times New Roman"/>
+        </w:rPr>
+      </w:r>
+    </w:p>
+    <w:p>
+      <w:pPr>
+        <w:pStyle w:val="957"/>
+        <w:numPr>
+          <w:ilvl w:val="0"/>
+          <w:numId w:val="19"/>
+        </w:numPr>
+        <w:pBdr/>
+        <w:spacing w:after="14" w:line="240" w:lineRule="auto"/>
+        <w:ind w:right="270"/>
+        <w:jc w:val="left"/>
+        <w:rPr>
+          <w:rFonts w:ascii="Times New Roman" w:hAnsi="Times New Roman" w:cs="Times New Roman"/>
+        </w:rPr>
+      </w:pPr>
+      <w:r>
+        <w:rPr>
+          <w:rFonts w:ascii="Times New Roman" w:hAnsi="Times New Roman" w:eastAsia="Times New Roman" w:cs="Times New Roman"/>
+          <w:color w:val="000000"/>
+          <w:sz w:val="28"/>
+          <w:szCs w:val="28"/>
+          <w:highlight w:val="none"/>
+          <w14:ligatures w14:val="none"/>
+        </w:rPr>
+        <w:t xml:space="preserve">Строка 11: (a = 1, b = 0, c = 1, d = 1) → a И НЕ b И c И d</w:t>
+      </w:r>
+      <w:r>
+        <w:rPr>
+          <w:rFonts w:ascii="Times New Roman" w:hAnsi="Times New Roman" w:eastAsia="Times New Roman" w:cs="Times New Roman"/>
+        </w:rPr>
+      </w:r>
+    </w:p>
+    <w:p>
+      <w:pPr>
+        <w:pStyle w:val="957"/>
+        <w:numPr>
+          <w:ilvl w:val="0"/>
+          <w:numId w:val="19"/>
+        </w:numPr>
+        <w:pBdr/>
+        <w:spacing w:after="14" w:line="240" w:lineRule="auto"/>
+        <w:ind w:right="270"/>
+        <w:jc w:val="left"/>
+        <w:rPr>
+          <w:rFonts w:ascii="Times New Roman" w:hAnsi="Times New Roman" w:cs="Times New Roman"/>
+        </w:rPr>
+      </w:pPr>
+      <w:r>
+        <w:rPr>
+          <w:rFonts w:ascii="Times New Roman" w:hAnsi="Times New Roman" w:eastAsia="Times New Roman" w:cs="Times New Roman"/>
+          <w:color w:val="000000"/>
+          <w:sz w:val="28"/>
+          <w:szCs w:val="28"/>
+          <w:highlight w:val="none"/>
+          <w14:ligatures w14:val="none"/>
+        </w:rPr>
+        <w:t xml:space="preserve">Строка 12: (a = 1, b = 1, c = 0, d = 0) → a И b И НЕ c И НЕ d</w:t>
+      </w:r>
+      <w:r>
+        <w:rPr>
+          <w:rFonts w:ascii="Times New Roman" w:hAnsi="Times New Roman" w:eastAsia="Times New Roman" w:cs="Times New Roman"/>
+        </w:rPr>
+      </w:r>
+    </w:p>
+    <w:p>
+      <w:pPr>
+        <w:pStyle w:val="957"/>
+        <w:numPr>
+          <w:ilvl w:val="0"/>
+          <w:numId w:val="19"/>
+        </w:numPr>
+        <w:pBdr/>
+        <w:spacing w:after="14" w:line="240" w:lineRule="auto"/>
+        <w:ind w:right="270"/>
+        <w:jc w:val="left"/>
+        <w:rPr>
+          <w:rFonts w:ascii="Times New Roman" w:hAnsi="Times New Roman" w:cs="Times New Roman"/>
+        </w:rPr>
+      </w:pPr>
+      <w:r>
+        <w:rPr>
+          <w:rFonts w:ascii="Times New Roman" w:hAnsi="Times New Roman" w:eastAsia="Times New Roman" w:cs="Times New Roman"/>
+          <w:color w:val="000000"/>
+          <w:sz w:val="28"/>
+          <w:szCs w:val="28"/>
+          <w:highlight w:val="none"/>
+          <w14:ligatures w14:val="none"/>
+        </w:rPr>
+        <w:t xml:space="preserve">Строка 13: (a = 1, b = 1, c = 0, d = 1) → a И b И НЕ c И d</w:t>
+      </w:r>
+      <w:r>
+        <w:rPr>
+          <w:rFonts w:ascii="Times New Roman" w:hAnsi="Times New Roman" w:eastAsia="Times New Roman" w:cs="Times New Roman"/>
+        </w:rPr>
+      </w:r>
+    </w:p>
+    <w:p>
+      <w:pPr>
+        <w:pStyle w:val="957"/>
+        <w:numPr>
+          <w:ilvl w:val="0"/>
+          <w:numId w:val="19"/>
+        </w:numPr>
+        <w:pBdr/>
+        <w:spacing w:after="14" w:line="240" w:lineRule="auto"/>
+        <w:ind w:right="270"/>
+        <w:jc w:val="left"/>
+        <w:rPr>
+          <w:rFonts w:ascii="Times New Roman" w:hAnsi="Times New Roman" w:cs="Times New Roman"/>
+        </w:rPr>
+      </w:pPr>
+      <w:r>
+        <w:rPr>
+          <w:rFonts w:ascii="Times New Roman" w:hAnsi="Times New Roman" w:eastAsia="Times New Roman" w:cs="Times New Roman"/>
+          <w:color w:val="000000"/>
+          <w:sz w:val="28"/>
+          <w:szCs w:val="28"/>
+          <w:highlight w:val="none"/>
+          <w14:ligatures w14:val="none"/>
+        </w:rPr>
+        <w:t xml:space="preserve">Строка 14: (a = 1, b = 1, c = 1, d = 0) → a И b И c И НЕ d</w:t>
+      </w:r>
+      <w:r>
+        <w:rPr>
+          <w:rFonts w:ascii="Times New Roman" w:hAnsi="Times New Roman" w:eastAsia="Times New Roman" w:cs="Times New Roman"/>
+        </w:rPr>
+      </w:r>
+    </w:p>
+    <w:p>
+      <w:pPr>
+        <w:pStyle w:val="957"/>
+        <w:numPr>
+          <w:ilvl w:val="0"/>
+          <w:numId w:val="19"/>
+        </w:numPr>
+        <w:pBdr/>
+        <w:spacing w:after="14" w:line="240" w:lineRule="auto"/>
+        <w:ind w:right="270"/>
+        <w:jc w:val="left"/>
+        <w:rPr>
+          <w:rFonts w:ascii="Times New Roman" w:hAnsi="Times New Roman" w:cs="Times New Roman"/>
+          <w:color w:val="000000"/>
+          <w:sz w:val="28"/>
+          <w:szCs w:val="28"/>
+          <w14:ligatures w14:val="none"/>
+        </w:rPr>
+      </w:pPr>
+      <w:r>
+        <w:rPr>
+          <w:rFonts w:ascii="Times New Roman" w:hAnsi="Times New Roman" w:eastAsia="Times New Roman" w:cs="Times New Roman"/>
+          <w:color w:val="000000"/>
+          <w:sz w:val="28"/>
+          <w:szCs w:val="28"/>
+          <w:highlight w:val="none"/>
+          <w14:ligatures w14:val="none"/>
+        </w:rPr>
+        <w:t xml:space="preserve">Строка 15: (a = 1, b = 1, c = 1, d = 1) → a И b И c И d</w:t>
+      </w:r>
+      <w:r>
+        <w:rPr>
+          <w:rFonts w:ascii="Times New Roman" w:hAnsi="Times New Roman" w:eastAsia="Times New Roman" w:cs="Times New Roman"/>
+          <w:color w:val="000000"/>
+          <w:sz w:val="28"/>
+          <w:szCs w:val="28"/>
+          <w:highlight w:val="none"/>
+          <w14:ligatures w14:val="none"/>
+        </w:rPr>
+      </w:r>
+      <w:r>
+        <w:rPr>
+          <w:rFonts w:ascii="Times New Roman" w:hAnsi="Times New Roman" w:cs="Times New Roman"/>
+          <w:color w:val="000000"/>
+          <w:sz w:val="28"/>
+          <w:szCs w:val="28"/>
+          <w14:ligatures w14:val="none"/>
+        </w:rPr>
+      </w:r>
+    </w:p>
+    <w:p>
+      <w:pPr>
+        <w:pBdr/>
+        <w:spacing w:after="14" w:line="240" w:lineRule="auto"/>
+        <w:ind w:right="270"/>
+        <w:jc w:val="left"/>
+        <w:rPr>
+          <w:rFonts w:ascii="Times New Roman" w:hAnsi="Times New Roman" w:cs="Times New Roman"/>
+          <w:color w:val="000000"/>
+          <w:sz w:val="28"/>
+          <w:szCs w:val="28"/>
+          <w14:ligatures w14:val="none"/>
+        </w:rPr>
+      </w:pPr>
+      <w:r>
+        <w:rPr>
+          <w:rFonts w:ascii="Times New Roman" w:hAnsi="Times New Roman" w:cs="Times New Roman"/>
+          <w:color w:val="000000"/>
+          <w:sz w:val="28"/>
+          <w:szCs w:val="28"/>
+          <w14:ligatures w14:val="none"/>
+        </w:rPr>
+      </w:r>
+      <w:r>
+        <w:rPr>
+          <w:rFonts w:ascii="Times New Roman" w:hAnsi="Times New Roman" w:cs="Times New Roman"/>
+          <w:color w:val="000000"/>
+          <w:sz w:val="28"/>
+          <w:szCs w:val="28"/>
+          <w14:ligatures w14:val="none"/>
+        </w:rPr>
+      </w:r>
+      <w:r>
+        <w:rPr>
+          <w:rFonts w:ascii="Times New Roman" w:hAnsi="Times New Roman" w:cs="Times New Roman"/>
+          <w:color w:val="000000"/>
+          <w:sz w:val="28"/>
+          <w:szCs w:val="28"/>
+          <w14:ligatures w14:val="none"/>
+        </w:rPr>
+      </w:r>
+    </w:p>
+    <w:p>
+      <w:pPr>
+        <w:pBdr/>
+        <w:spacing w:after="14" w:line="240" w:lineRule="auto"/>
+        <w:ind w:right="270"/>
+        <w:jc w:val="left"/>
+        <w:rPr/>
+      </w:pPr>
+      <w:r>
+        <w:rPr>
+          <w:rFonts w:ascii="Times New Roman" w:hAnsi="Times New Roman" w:eastAsia="Times New Roman" w:cs="Times New Roman"/>
+          <w:b/>
+          <w:bCs/>
+          <w:color w:val="000000"/>
+          <w:sz w:val="28"/>
+          <w:szCs w:val="28"/>
+          <w:highlight w:val="none"/>
+          <w14:ligatures w14:val="none"/>
+        </w:rPr>
+        <w:t xml:space="preserve">Формула СДНФ</w:t>
+      </w:r>
+      <w:r>
+        <w:rPr>
+          <w:rFonts w:ascii="Times New Roman" w:hAnsi="Times New Roman" w:eastAsia="Times New Roman" w:cs="Times New Roman"/>
+          <w:color w:val="000000"/>
+          <w:sz w:val="28"/>
+          <w:szCs w:val="28"/>
+          <w:highlight w:val="none"/>
+          <w14:ligatures w14:val="none"/>
+        </w:rPr>
+        <w:t xml:space="preserve">:</w:t>
+      </w:r>
+      <w:r/>
+    </w:p>
+    <w:p>
+      <w:pPr>
+        <w:pBdr/>
+        <w:spacing w:after="14" w:line="240" w:lineRule="auto"/>
+        <w:ind w:right="270"/>
+        <w:jc w:val="left"/>
+        <w:rPr>
+          <w:rFonts w:ascii="Times New Roman" w:hAnsi="Times New Roman" w:eastAsia="Times New Roman" w:cs="Times New Roman"/>
+          <w:color w:val="000000"/>
+          <w:sz w:val="28"/>
+          <w:szCs w:val="28"/>
+          <w:highlight w:val="none"/>
+          <w14:ligatures w14:val="none"/>
+        </w:rPr>
+      </w:pPr>
+      <w:r>
+        <w:rPr>
+          <w:rFonts w:ascii="Times New Roman" w:hAnsi="Times New Roman" w:eastAsia="Times New Roman" w:cs="Times New Roman"/>
+          <w:color w:val="000000"/>
+          <w:sz w:val="28"/>
+          <w:szCs w:val="28"/>
+          <w:highlight w:val="none"/>
+          <w14:ligatures w14:val="none"/>
+        </w:rPr>
+        <w:t xml:space="preserve">F_СДНФ = (НЕ a И НЕ b И НЕ c И НЕ d) ИЛИ (НЕ a И НЕ b И c И НЕ d) ИЛИ (НЕ a И b И НЕ c И d) ИЛИ (НЕ a И b И c И НЕ d) ИЛИ (НЕ a И b И c И d) ИЛИ (a И НЕ b И НЕ c И НЕ d) ИЛИ (a И НЕ b И c И d) ИЛИ (a И b И НЕ c И НЕ d) ИЛИ (a И b И НЕ c И d) ИЛИ (a И b И c </w:t>
+      </w:r>
+      <w:r>
+        <w:rPr>
+          <w:rFonts w:ascii="Times New Roman" w:hAnsi="Times New Roman" w:eastAsia="Times New Roman" w:cs="Times New Roman"/>
+          <w:color w:val="000000"/>
+          <w:sz w:val="28"/>
+          <w:szCs w:val="28"/>
+          <w:highlight w:val="none"/>
+          <w14:ligatures w14:val="none"/>
+        </w:rPr>
+        <w:t xml:space="preserve">И НЕ d) ИЛИ (a И b И c И d)</w:t>
+      </w:r>
+      <w:r/>
+      <w:r>
+        <w:rPr>
+          <w:rFonts w:ascii="Times New Roman" w:hAnsi="Times New Roman" w:eastAsia="Times New Roman" w:cs="Times New Roman"/>
+          <w:color w:val="000000"/>
+          <w:sz w:val="28"/>
+          <w:szCs w:val="28"/>
+          <w:highlight w:val="none"/>
+          <w14:ligatures w14:val="none"/>
+        </w:rPr>
+      </w:r>
+      <w:r>
+        <w:rPr>
+          <w:rFonts w:ascii="Times New Roman" w:hAnsi="Times New Roman" w:eastAsia="Times New Roman" w:cs="Times New Roman"/>
+          <w:color w:val="000000"/>
+          <w:sz w:val="28"/>
+          <w:szCs w:val="28"/>
+          <w:highlight w:val="none"/>
+          <w14:ligatures w14:val="none"/>
+        </w:rPr>
+      </w:r>
+      <w:r>
+        <w:rPr>
+          <w:rFonts w:ascii="Times New Roman" w:hAnsi="Times New Roman" w:cs="Times New Roman"/>
+          <w:color w:val="000000"/>
+          <w:sz w:val="28"/>
+          <w:szCs w:val="28"/>
+          <w14:ligatures w14:val="none"/>
+        </w:rPr>
+      </w:r>
+    </w:p>
+    <w:p>
+      <w:pPr>
+        <w:pBdr/>
+        <w:spacing w:after="14" w:line="240" w:lineRule="auto"/>
+        <w:ind w:right="270"/>
+        <w:jc w:val="left"/>
+        <w:rPr>
+          <w:rFonts w:ascii="Times New Roman" w:hAnsi="Times New Roman" w:cs="Times New Roman"/>
+          <w:color w:val="000000"/>
+          <w:sz w:val="28"/>
+          <w:szCs w:val="28"/>
+          <w14:ligatures w14:val="none"/>
+        </w:rPr>
+      </w:pPr>
+      <w:r>
+        <w:rPr>
+          <w:rFonts w:ascii="Times New Roman" w:hAnsi="Times New Roman" w:cs="Times New Roman"/>
+          <w:color w:val="000000"/>
+          <w:sz w:val="28"/>
+          <w:szCs w:val="28"/>
+          <w14:ligatures w14:val="none"/>
+        </w:rPr>
+      </w:r>
+      <w:r>
+        <w:rPr>
+          <w:rFonts w:ascii="Times New Roman" w:hAnsi="Times New Roman" w:cs="Times New Roman"/>
+          <w:color w:val="000000"/>
+          <w:sz w:val="28"/>
+          <w:szCs w:val="28"/>
+          <w14:ligatures w14:val="none"/>
+        </w:rPr>
+      </w:r>
+      <w:r>
+        <w:rPr>
+          <w:rFonts w:ascii="Times New Roman" w:hAnsi="Times New Roman" w:cs="Times New Roman"/>
+          <w:color w:val="000000"/>
+          <w:sz w:val="28"/>
+          <w:szCs w:val="28"/>
+          <w14:ligatures w14:val="none"/>
+        </w:rPr>
+      </w:r>
+    </w:p>
+    <w:p>
+      <w:pPr>
+        <w:pBdr/>
+        <w:spacing w:after="14" w:line="240" w:lineRule="auto"/>
+        <w:ind w:right="270"/>
+        <w:jc w:val="left"/>
+        <w:rPr>
+          <w:rFonts w:ascii="Times New Roman" w:hAnsi="Times New Roman" w:cs="Times New Roman"/>
+          <w:color w:val="000000"/>
+          <w:sz w:val="28"/>
+          <w:szCs w:val="28"/>
+          <w14:ligatures w14:val="none"/>
+        </w:rPr>
+      </w:pPr>
+      <w:r>
+        <w:rPr>
+          <w:rFonts w:ascii="Times New Roman" w:hAnsi="Times New Roman" w:cs="Times New Roman"/>
+          <w:color w:val="000000"/>
+          <w:sz w:val="28"/>
+          <w:szCs w:val="28"/>
+          <w14:ligatures w14:val="none"/>
+        </w:rPr>
+      </w:r>
+      <w:r>
+        <w:rPr>
+          <w:rFonts w:ascii="Times New Roman" w:hAnsi="Times New Roman" w:cs="Times New Roman"/>
+          <w:color w:val="000000"/>
+          <w:sz w:val="28"/>
+          <w:szCs w:val="28"/>
+          <w14:ligatures w14:val="none"/>
+        </w:rPr>
+      </w:r>
+      <w:r>
+        <w:rPr>
+          <w:rFonts w:ascii="Times New Roman" w:hAnsi="Times New Roman" w:cs="Times New Roman"/>
+          <w:color w:val="000000"/>
+          <w:sz w:val="28"/>
+          <w:szCs w:val="28"/>
+          <w14:ligatures w14:val="none"/>
+        </w:rPr>
+      </w:r>
+    </w:p>
+    <w:p>
+      <w:pPr>
+        <w:pBdr/>
+        <w:spacing w:after="14" w:line="240" w:lineRule="auto"/>
+        <w:ind w:right="270"/>
+        <w:jc w:val="left"/>
+        <w:rPr>
+          <w:b/>
+          <w:bCs/>
+        </w:rPr>
+      </w:pPr>
+      <w:r>
+        <w:rPr>
+          <w:rFonts w:ascii="Times New Roman" w:hAnsi="Times New Roman" w:eastAsia="Times New Roman" w:cs="Times New Roman"/>
+          <w:b/>
+          <w:bCs/>
+          <w:color w:val="000000"/>
+          <w:sz w:val="28"/>
+          <w:szCs w:val="28"/>
+          <w:highlight w:val="none"/>
+          <w14:ligatures w14:val="none"/>
+        </w:rPr>
+        <w:t xml:space="preserve">Построение СКНФ</w:t>
+      </w:r>
+      <w:r>
+        <w:rPr>
+          <w:b/>
+          <w:bCs/>
+        </w:rPr>
+      </w:r>
+    </w:p>
+    <w:p>
+      <w:pPr>
+        <w:pBdr/>
+        <w:spacing w:after="14" w:line="240" w:lineRule="auto"/>
+        <w:ind w:right="270"/>
+        <w:jc w:val="left"/>
+        <w:rPr>
+          <w:rFonts w:ascii="Times New Roman" w:hAnsi="Times New Roman" w:eastAsia="Times New Roman" w:cs="Times New Roman"/>
+          <w:color w:val="000000"/>
+          <w:sz w:val="28"/>
+          <w:szCs w:val="28"/>
+          <w:highlight w:val="none"/>
+          <w14:ligatures w14:val="none"/>
+        </w:rPr>
+      </w:pPr>
+      <w:r>
+        <w:rPr>
+          <w:rFonts w:ascii="Times New Roman" w:hAnsi="Times New Roman" w:eastAsia="Times New Roman" w:cs="Times New Roman"/>
+          <w:color w:val="000000"/>
+          <w:sz w:val="28"/>
+          <w:szCs w:val="28"/>
+          <w:highlight w:val="none"/>
+          <w14:ligatures w14:val="none"/>
+        </w:rPr>
+        <w:t xml:space="preserve">Совершенная конъюнктивная нормальная форма (СКНФ) строится для строк, где функция принимает значение 0</w:t>
+      </w:r>
+      <w:r>
+        <w:rPr>
+          <w:rFonts w:ascii="Times New Roman" w:hAnsi="Times New Roman" w:eastAsia="Times New Roman" w:cs="Times New Roman"/>
+          <w:color w:val="000000"/>
+          <w:sz w:val="28"/>
+          <w:szCs w:val="28"/>
+          <w:highlight w:val="none"/>
+          <w14:ligatures w14:val="none"/>
+        </w:rPr>
+      </w:r>
+    </w:p>
+    <w:p>
+      <w:pPr>
+        <w:pBdr/>
+        <w:spacing w:after="14" w:line="240" w:lineRule="auto"/>
+        <w:ind w:right="270"/>
+        <w:jc w:val="left"/>
+        <w:rPr>
+          <w:rFonts w:ascii="Times New Roman" w:hAnsi="Times New Roman" w:eastAsia="Times New Roman" w:cs="Times New Roman"/>
+          <w:color w:val="000000"/>
+          <w:sz w:val="28"/>
+          <w:szCs w:val="28"/>
+          <w:highlight w:val="none"/>
+          <w14:ligatures w14:val="none"/>
+        </w:rPr>
+      </w:pPr>
+      <w:r>
+        <w:rPr>
+          <w:rFonts w:ascii="Times New Roman" w:hAnsi="Times New Roman" w:eastAsia="Times New Roman" w:cs="Times New Roman"/>
+          <w:color w:val="000000"/>
+          <w:sz w:val="28"/>
+          <w:szCs w:val="28"/>
+          <w:highlight w:val="none"/>
+          <w14:ligatures w14:val="none"/>
+        </w:rPr>
+      </w:r>
+      <w:r>
+        <w:rPr>
+          <w:rFonts w:ascii="Times New Roman" w:hAnsi="Times New Roman" w:eastAsia="Times New Roman" w:cs="Times New Roman"/>
+          <w:color w:val="000000"/>
+          <w:sz w:val="28"/>
+          <w:szCs w:val="28"/>
+          <w:highlight w:val="none"/>
+          <w14:ligatures w14:val="none"/>
+        </w:rPr>
+      </w:r>
+      <w:r>
+        <w:rPr>
+          <w:rFonts w:ascii="Times New Roman" w:hAnsi="Times New Roman" w:eastAsia="Times New Roman" w:cs="Times New Roman"/>
+          <w:color w:val="000000"/>
+          <w:sz w:val="28"/>
+          <w:szCs w:val="28"/>
+          <w:highlight w:val="none"/>
+          <w14:ligatures w14:val="none"/>
+        </w:rPr>
+      </w:r>
+    </w:p>
+    <w:p>
+      <w:pPr>
+        <w:pBdr/>
+        <w:spacing w:after="14" w:line="240" w:lineRule="auto"/>
+        <w:ind w:right="270"/>
+        <w:jc w:val="left"/>
+        <w:rPr>
+          <w:b/>
+          <w:bCs/>
+        </w:rPr>
+      </w:pPr>
+      <w:r>
+        <w:rPr>
+          <w:rFonts w:ascii="Times New Roman" w:hAnsi="Times New Roman" w:eastAsia="Times New Roman" w:cs="Times New Roman"/>
+          <w:b/>
+          <w:bCs/>
+          <w:color w:val="000000"/>
+          <w:sz w:val="28"/>
+          <w:szCs w:val="28"/>
+          <w:highlight w:val="none"/>
+          <w14:ligatures w14:val="none"/>
+        </w:rPr>
+        <w:t xml:space="preserve">Функция равна 0 в следующих строках:</w:t>
+      </w:r>
+      <w:r>
+        <w:rPr>
+          <w:b/>
+          <w:bCs/>
+        </w:rPr>
+      </w:r>
+      <w:r>
+        <w:rPr>
+          <w:rFonts w:ascii="Times New Roman" w:hAnsi="Times New Roman" w:eastAsia="Times New Roman" w:cs="Times New Roman"/>
+          <w:b/>
+          <w:bCs/>
+          <w:color w:val="000000"/>
+          <w:sz w:val="28"/>
+          <w:szCs w:val="28"/>
+          <w:highlight w:val="none"/>
+          <w14:ligatures w14:val="none"/>
+        </w:rPr>
+      </w:r>
+    </w:p>
+    <w:p>
+      <w:pPr>
+        <w:pStyle w:val="957"/>
+        <w:numPr>
+          <w:ilvl w:val="0"/>
+          <w:numId w:val="20"/>
+        </w:numPr>
+        <w:pBdr/>
+        <w:spacing w:after="14" w:line="240" w:lineRule="auto"/>
+        <w:ind w:right="270"/>
+        <w:jc w:val="left"/>
+        <w:rPr/>
+      </w:pPr>
+      <w:r>
+        <w:rPr>
+          <w:rFonts w:ascii="Times New Roman" w:hAnsi="Times New Roman" w:eastAsia="Times New Roman" w:cs="Times New Roman"/>
+          <w:color w:val="000000"/>
+          <w:sz w:val="28"/>
+          <w:szCs w:val="28"/>
+          <w:highlight w:val="none"/>
+          <w14:ligatures w14:val="none"/>
+        </w:rPr>
+        <w:t xml:space="preserve">Строка 1: (a = 0, b = 0, c = 0, d = 1) → a ИЛИ b ИЛИ c ИЛИ НЕ d</w:t>
+      </w:r>
+      <w:r/>
+    </w:p>
+    <w:p>
+      <w:pPr>
+        <w:pStyle w:val="957"/>
+        <w:numPr>
+          <w:ilvl w:val="0"/>
+          <w:numId w:val="20"/>
+        </w:numPr>
+        <w:pBdr/>
+        <w:spacing w:after="14" w:line="240" w:lineRule="auto"/>
+        <w:ind w:right="270"/>
+        <w:jc w:val="left"/>
+        <w:rPr/>
+      </w:pPr>
+      <w:r>
+        <w:rPr>
+          <w:rFonts w:ascii="Times New Roman" w:hAnsi="Times New Roman" w:eastAsia="Times New Roman" w:cs="Times New Roman"/>
+          <w:color w:val="000000"/>
+          <w:sz w:val="28"/>
+          <w:szCs w:val="28"/>
+          <w:highlight w:val="none"/>
+          <w14:ligatures w14:val="none"/>
+        </w:rPr>
+        <w:t xml:space="preserve">Строка 3: (a = 0, b = 0, c = 1, d = 1) → a ИЛИ b ИЛИ НЕ c ИЛИ НЕ d</w:t>
+      </w:r>
+      <w:r/>
+    </w:p>
+    <w:p>
+      <w:pPr>
+        <w:pStyle w:val="957"/>
+        <w:numPr>
+          <w:ilvl w:val="0"/>
+          <w:numId w:val="20"/>
+        </w:numPr>
+        <w:pBdr/>
+        <w:spacing w:after="14" w:line="240" w:lineRule="auto"/>
+        <w:ind w:right="270"/>
+        <w:jc w:val="left"/>
+        <w:rPr/>
+      </w:pPr>
+      <w:r>
+        <w:rPr>
+          <w:rFonts w:ascii="Times New Roman" w:hAnsi="Times New Roman" w:eastAsia="Times New Roman" w:cs="Times New Roman"/>
+          <w:color w:val="000000"/>
+          <w:sz w:val="28"/>
+          <w:szCs w:val="28"/>
+          <w:highlight w:val="none"/>
+          <w14:ligatures w14:val="none"/>
+        </w:rPr>
+        <w:t xml:space="preserve">Строка 4: (a = 0, b = 1, c = 0, d = 0) → a ИЛИ НЕ b ИЛИ c ИЛИ d</w:t>
+      </w:r>
+      <w:r/>
+    </w:p>
+    <w:p>
+      <w:pPr>
+        <w:pStyle w:val="957"/>
+        <w:numPr>
+          <w:ilvl w:val="0"/>
+          <w:numId w:val="20"/>
+        </w:numPr>
+        <w:pBdr/>
+        <w:spacing w:after="14" w:line="240" w:lineRule="auto"/>
+        <w:ind w:right="270"/>
+        <w:jc w:val="left"/>
+        <w:rPr/>
+      </w:pPr>
+      <w:r>
+        <w:rPr>
+          <w:rFonts w:ascii="Times New Roman" w:hAnsi="Times New Roman" w:eastAsia="Times New Roman" w:cs="Times New Roman"/>
+          <w:color w:val="000000"/>
+          <w:sz w:val="28"/>
+          <w:szCs w:val="28"/>
+          <w:highlight w:val="none"/>
+          <w14:ligatures w14:val="none"/>
+        </w:rPr>
+        <w:t xml:space="preserve">Строка 9: (a = 1, b = 0, c = 0, d = 1) → НЕ a ИЛИ b ИЛИ c ИЛИ НЕ d</w:t>
+      </w:r>
+      <w:r/>
+    </w:p>
+    <w:p>
+      <w:pPr>
+        <w:pStyle w:val="957"/>
+        <w:numPr>
+          <w:ilvl w:val="0"/>
+          <w:numId w:val="20"/>
+        </w:numPr>
+        <w:pBdr/>
+        <w:spacing w:after="14" w:line="240" w:lineRule="auto"/>
+        <w:ind w:right="270"/>
+        <w:jc w:val="left"/>
+        <w:rPr/>
+      </w:pPr>
+      <w:r>
+        <w:rPr>
+          <w:rFonts w:ascii="Times New Roman" w:hAnsi="Times New Roman" w:eastAsia="Times New Roman" w:cs="Times New Roman"/>
+          <w:color w:val="000000"/>
+          <w:sz w:val="28"/>
+          <w:szCs w:val="28"/>
+          <w:highlight w:val="none"/>
+          <w14:ligatures w14:val="none"/>
+        </w:rPr>
+        <w:t xml:space="preserve">Строка 10: (a = 1, b = 0, c = 1, d = 0) → НЕ a ИЛИ b ИЛИ НЕ c ИЛИ d</w:t>
+        <w:br/>
+      </w:r>
+      <w:r>
+        <w:rPr>
+          <w:rFonts w:ascii="Times New Roman" w:hAnsi="Times New Roman" w:eastAsia="Times New Roman" w:cs="Times New Roman"/>
+          <w:color w:val="000000"/>
+          <w:sz w:val="28"/>
+          <w:szCs w:val="28"/>
+          <w:highlight w:val="none"/>
+          <w14:ligatures w14:val="none"/>
+        </w:rPr>
+      </w:r>
+    </w:p>
+    <w:p>
+      <w:pPr>
+        <w:pBdr/>
+        <w:spacing w:after="14" w:line="240" w:lineRule="auto"/>
+        <w:ind w:right="270"/>
+        <w:jc w:val="left"/>
+        <w:rPr>
+          <w:b/>
+          <w:bCs/>
+        </w:rPr>
+      </w:pPr>
+      <w:r>
+        <w:rPr>
+          <w:rFonts w:ascii="Times New Roman" w:hAnsi="Times New Roman" w:eastAsia="Times New Roman" w:cs="Times New Roman"/>
+          <w:b/>
+          <w:bCs/>
+          <w:color w:val="000000"/>
+          <w:sz w:val="28"/>
+          <w:szCs w:val="28"/>
+          <w:highlight w:val="none"/>
+          <w14:ligatures w14:val="none"/>
+        </w:rPr>
+        <w:t xml:space="preserve">Формула СКНФ:</w:t>
+      </w:r>
+      <w:r>
+        <w:rPr>
+          <w:b/>
+          <w:bCs/>
+        </w:rPr>
+      </w:r>
+    </w:p>
+    <w:p>
+      <w:pPr>
+        <w:pBdr/>
+        <w:spacing w:after="14" w:line="240" w:lineRule="auto"/>
+        <w:ind w:right="270"/>
+        <w:jc w:val="left"/>
+        <w:rPr>
+          <w:rFonts w:ascii="Times New Roman" w:hAnsi="Times New Roman" w:eastAsia="Times New Roman" w:cs="Times New Roman"/>
+          <w:color w:val="000000"/>
+          <w:sz w:val="28"/>
+          <w:szCs w:val="28"/>
+          <w:highlight w:val="none"/>
+          <w14:ligatures w14:val="none"/>
+        </w:rPr>
+      </w:pPr>
+      <w:r>
+        <w:rPr>
+          <w:rFonts w:ascii="Times New Roman" w:hAnsi="Times New Roman" w:eastAsia="Times New Roman" w:cs="Times New Roman"/>
+          <w:color w:val="000000"/>
+          <w:sz w:val="28"/>
+          <w:szCs w:val="28"/>
+          <w:highlight w:val="none"/>
+          <w14:ligatures w14:val="none"/>
+        </w:rPr>
+        <w:t xml:space="preserve">F_СКНФ = (a ИЛИ b ИЛИ c ИЛИ НЕ d) И (a ИЛИ b ИЛИ НЕ c ИЛИ НЕ d) И (a ИЛИ НЕ b ИЛИ c ИЛИ d) И (НЕ a ИЛИ b ИЛИ c ИЛИ НЕ d) И (НЕ a ИЛИ b ИЛИ НЕ c ИЛИ d)</w:t>
+      </w:r>
+      <w:r/>
+      <w:r>
+        <w:rPr>
+          <w:rFonts w:ascii="Times New Roman" w:hAnsi="Times New Roman" w:eastAsia="Times New Roman" w:cs="Times New Roman"/>
+          <w:color w:val="000000"/>
+          <w:sz w:val="28"/>
+          <w:szCs w:val="28"/>
+          <w:highlight w:val="none"/>
+          <w14:ligatures w14:val="none"/>
+        </w:rPr>
+      </w:r>
+      <w:r>
+        <w:rPr>
+          <w:rFonts w:ascii="Times New Roman" w:hAnsi="Times New Roman" w:eastAsia="Times New Roman" w:cs="Times New Roman"/>
+          <w:color w:val="000000"/>
+          <w:sz w:val="28"/>
+          <w:szCs w:val="28"/>
+          <w:highlight w:val="none"/>
+          <w14:ligatures w14:val="none"/>
+        </w:rPr>
+      </w:r>
+      <w:r>
+        <w:rPr>
+          <w:rFonts w:ascii="Times New Roman" w:hAnsi="Times New Roman" w:eastAsia="Times New Roman" w:cs="Times New Roman"/>
+          <w:color w:val="000000"/>
+          <w:sz w:val="28"/>
+          <w:szCs w:val="28"/>
+          <w:highlight w:val="none"/>
+          <w14:ligatures w14:val="none"/>
+        </w:rPr>
+      </w:r>
+    </w:p>
+    <w:p>
+      <w:pPr>
+        <w:pBdr/>
+        <w:spacing w:after="14" w:line="240" w:lineRule="auto"/>
+        <w:ind w:right="270"/>
+        <w:jc w:val="left"/>
+        <w:rPr>
+          <w:rFonts w:ascii="Times New Roman" w:hAnsi="Times New Roman" w:eastAsia="Times New Roman" w:cs="Times New Roman"/>
+          <w:color w:val="000000"/>
+          <w:sz w:val="28"/>
+          <w:szCs w:val="28"/>
+          <w:highlight w:val="none"/>
+          <w14:ligatures w14:val="none"/>
+        </w:rPr>
+      </w:pPr>
+      <w:r>
+        <w:rPr>
+          <w:rFonts w:ascii="Times New Roman" w:hAnsi="Times New Roman" w:eastAsia="Times New Roman" w:cs="Times New Roman"/>
+          <w:color w:val="000000"/>
+          <w:sz w:val="28"/>
+          <w:szCs w:val="28"/>
+          <w:highlight w:val="none"/>
+          <w14:ligatures w14:val="none"/>
+        </w:rPr>
+      </w:r>
+      <w:r>
+        <w:rPr>
+          <w:rFonts w:ascii="Times New Roman" w:hAnsi="Times New Roman" w:eastAsia="Times New Roman" w:cs="Times New Roman"/>
+          <w:color w:val="000000"/>
+          <w:sz w:val="28"/>
+          <w:szCs w:val="28"/>
+          <w:highlight w:val="none"/>
+          <w14:ligatures w14:val="none"/>
+        </w:rPr>
+      </w:r>
+      <w:r>
+        <w:rPr>
+          <w:rFonts w:ascii="Times New Roman" w:hAnsi="Times New Roman" w:eastAsia="Times New Roman" w:cs="Times New Roman"/>
+          <w:color w:val="000000"/>
+          <w:sz w:val="28"/>
+          <w:szCs w:val="28"/>
+          <w:highlight w:val="none"/>
+          <w14:ligatures w14:val="none"/>
+        </w:rPr>
+      </w:r>
+    </w:p>
+    <w:p>
+      <w:pPr>
+        <w:pBdr/>
+        <w:spacing w:after="14" w:line="240" w:lineRule="auto"/>
+        <w:ind w:right="270"/>
+        <w:jc w:val="left"/>
+        <w:rPr>
+          <w:rFonts w:ascii="Times New Roman" w:hAnsi="Times New Roman" w:eastAsia="Times New Roman" w:cs="Times New Roman"/>
+          <w:color w:val="000000"/>
+          <w:sz w:val="28"/>
+          <w:szCs w:val="28"/>
+          <w:highlight w:val="none"/>
+          <w14:ligatures w14:val="none"/>
+        </w:rPr>
+      </w:pPr>
+      <w:r>
+        <w:rPr>
+          <w:rFonts w:ascii="Times New Roman" w:hAnsi="Times New Roman" w:eastAsia="Times New Roman" w:cs="Times New Roman"/>
+          <w:color w:val="000000"/>
+          <w:sz w:val="28"/>
+          <w:szCs w:val="28"/>
+          <w:highlight w:val="none"/>
+          <w14:ligatures w14:val="none"/>
+        </w:rPr>
+      </w:r>
+      <w:r>
+        <w:rPr>
+          <w:rFonts w:ascii="Times New Roman" w:hAnsi="Times New Roman" w:eastAsia="Times New Roman" w:cs="Times New Roman"/>
+          <w:color w:val="000000"/>
+          <w:sz w:val="28"/>
+          <w:szCs w:val="28"/>
+          <w:highlight w:val="none"/>
+          <w14:ligatures w14:val="none"/>
+        </w:rPr>
+      </w:r>
+      <w:r>
+        <w:rPr>
+          <w:rFonts w:ascii="Times New Roman" w:hAnsi="Times New Roman" w:eastAsia="Times New Roman" w:cs="Times New Roman"/>
+          <w:color w:val="000000"/>
+          <w:sz w:val="28"/>
+          <w:szCs w:val="28"/>
+          <w:highlight w:val="none"/>
+          <w14:ligatures w14:val="none"/>
+        </w:rPr>
+      </w:r>
+    </w:p>
+    <w:p>
+      <w:pPr>
+        <w:pBdr/>
+        <w:spacing w:after="14" w:line="240" w:lineRule="auto"/>
+        <w:ind w:right="270"/>
+        <w:jc w:val="left"/>
+        <w:rPr>
+          <w:rFonts w:ascii="Times New Roman" w:hAnsi="Times New Roman" w:eastAsia="Times New Roman" w:cs="Times New Roman"/>
+          <w:b/>
+          <w:bCs/>
+          <w:color w:val="000000"/>
+          <w:sz w:val="28"/>
+          <w:szCs w:val="28"/>
+          <w:highlight w:val="none"/>
+          <w14:ligatures w14:val="none"/>
+        </w:rPr>
+      </w:pPr>
+      <w:r>
+        <w:rPr>
+          <w:rFonts w:ascii="Times New Roman" w:hAnsi="Times New Roman" w:eastAsia="Times New Roman" w:cs="Times New Roman"/>
+          <w:b/>
+          <w:bCs/>
+          <w:color w:val="000000"/>
+          <w:sz w:val="28"/>
+          <w:szCs w:val="28"/>
+          <w:highlight w:val="none"/>
+          <w14:ligatures w14:val="none"/>
+        </w:rPr>
+      </w:r>
+      <w:r>
+        <w:rPr>
+          <w:rFonts w:ascii="Times New Roman" w:hAnsi="Times New Roman" w:eastAsia="Times New Roman" w:cs="Times New Roman"/>
+          <w:b/>
+          <w:bCs/>
+          <w:color w:val="000000"/>
+          <w:sz w:val="28"/>
+          <w:szCs w:val="28"/>
+          <w:highlight w:val="none"/>
+          <w14:ligatures w14:val="none"/>
+        </w:rPr>
+      </w:r>
+      <w:r>
+        <w:rPr>
+          <w:rFonts w:ascii="Times New Roman" w:hAnsi="Times New Roman" w:eastAsia="Times New Roman" w:cs="Times New Roman"/>
+          <w:b/>
+          <w:bCs/>
+          <w:color w:val="000000"/>
+          <w:sz w:val="28"/>
+          <w:szCs w:val="28"/>
+          <w:highlight w:val="none"/>
+          <w14:ligatures w14:val="none"/>
+        </w:rPr>
+      </w:r>
+    </w:p>
+    <w:p>
+      <w:pPr>
+        <w:pBdr/>
+        <w:spacing w:after="14" w:line="240" w:lineRule="auto"/>
+        <w:ind w:right="270"/>
+        <w:jc w:val="left"/>
+        <w:rPr>
+          <w:rFonts w:ascii="Times New Roman" w:hAnsi="Times New Roman" w:eastAsia="Times New Roman" w:cs="Times New Roman"/>
+          <w:b/>
+          <w:bCs/>
+          <w:color w:val="000000"/>
+          <w:sz w:val="28"/>
+          <w:szCs w:val="28"/>
+          <w:highlight w:val="none"/>
+        </w:rPr>
+      </w:pPr>
+      <w:r>
+        <w:rPr>
+          <w:rFonts w:ascii="Times New Roman" w:hAnsi="Times New Roman" w:eastAsia="Times New Roman" w:cs="Times New Roman"/>
+          <w:b/>
+          <w:bCs/>
+          <w:color w:val="000000"/>
+          <w:sz w:val="28"/>
+          <w:szCs w:val="28"/>
+          <w:highlight w:val="none"/>
+          <w14:ligatures w14:val="none"/>
+        </w:rPr>
+        <w:t xml:space="preserve">Вывод</w:t>
+      </w:r>
+      <w:r>
+        <w:rPr>
+          <w:b/>
+          <w:bCs/>
+        </w:rPr>
+      </w:r>
+    </w:p>
+    <w:p>
+      <w:pPr>
+        <w:pBdr/>
+        <w:spacing w:after="14" w:line="240" w:lineRule="auto"/>
+        <w:ind w:right="270"/>
+        <w:jc w:val="left"/>
+        <w:rPr>
+          <w:rFonts w:ascii="Times New Roman" w:hAnsi="Times New Roman" w:eastAsia="Times New Roman" w:cs="Times New Roman"/>
+          <w:color w:val="000000"/>
+          <w:sz w:val="28"/>
+          <w:szCs w:val="28"/>
+          <w:highlight w:val="none"/>
+          <w14:ligatures w14:val="none"/>
+        </w:rPr>
+      </w:pPr>
+      <w:r>
+        <w:rPr>
+          <w:rFonts w:ascii="Times New Roman" w:hAnsi="Times New Roman" w:eastAsia="Times New Roman" w:cs="Times New Roman"/>
+          <w:color w:val="000000"/>
+          <w:sz w:val="28"/>
+          <w:szCs w:val="28"/>
+          <w:highlight w:val="none"/>
+          <w14:ligatures w14:val="none"/>
+        </w:rPr>
+        <w:t xml:space="preserve">В ходе работы изучены методы построения логических функций в форме СДНФ и СКНФ. Восстановлена таблица истинности для функции </w:t>
+      </w:r>
+      <w:r/>
+      <w:r>
+        <w:rPr>
+          <w:rFonts w:ascii="Times New Roman" w:hAnsi="Times New Roman" w:eastAsia="Times New Roman" w:cs="Times New Roman"/>
+          <w:color w:val="000000"/>
+          <w:sz w:val="28"/>
+          <w:szCs w:val="28"/>
+          <w:highlight w:val="none"/>
+          <w14:ligatures w14:val="none"/>
+        </w:rPr>
+      </w:r>
+      <w:r>
+        <w:rPr>
+          <w:rFonts w:ascii="Times New Roman" w:hAnsi="Times New Roman" w:eastAsia="Times New Roman" w:cs="Times New Roman"/>
+          <w:color w:val="000000"/>
+          <w:sz w:val="28"/>
+          <w:szCs w:val="28"/>
+          <w:highlight w:val="none"/>
+          <w14:ligatures w14:val="none"/>
+        </w:rPr>
+      </w:r>
+      <m:oMath>
+        <m:r>
+          <w:rPr>
+            <w:sz w:val="32"/>
+            <w:szCs w:val="32"/>
+          </w:rPr>
+          <m:rPr/>
+          <m:t>F(a,</m:t>
+        </m:r>
+        <m:r>
+          <w:rPr>
+            <w:sz w:val="32"/>
+            <w:szCs w:val="32"/>
+          </w:rPr>
+          <m:rPr/>
+          <m:t>b,c,d)=A79F </m:t>
+        </m:r>
+        <m:r>
+          <w:rPr>
+            <w:sz w:val="32"/>
+            <w:szCs w:val="32"/>
+          </w:rPr>
+          <m:rPr/>
+          <m:t>16</m:t>
+        </m:r>
+        <m:r>
+          <w:rPr>
+            <w:sz w:val="32"/>
+            <w:szCs w:val="32"/>
+          </w:rPr>
+          <m:rPr/>
+          <m:t>​</m:t>
+        </m:r>
+        <m:r>
+          <w:rPr>
+            <w:sz w:val="32"/>
+            <w:szCs w:val="32"/>
+          </w:rPr>
+          <m:rPr/>
+          <m:t>  </m:t>
+        </m:r>
+      </m:oMath>
+      <w:r>
+        <w:rPr>
+          <w:rFonts w:ascii="Times New Roman" w:hAnsi="Times New Roman" w:eastAsia="Times New Roman" w:cs="Times New Roman"/>
+          <w:color w:val="000000"/>
+          <w:sz w:val="28"/>
+          <w:szCs w:val="28"/>
+          <w:highlight w:val="none"/>
+          <w14:ligatures w14:val="none"/>
+        </w:rPr>
+        <w:t xml:space="preserve">на основе шестнадцатеричного представления. Построены формулы СДНФ и СКНФ. Нормальные формы позволяют стандартизировать представление логических функций и упрощают проектирование цифровых схем</w:t>
+      </w:r>
       <w:r>
         <w:rPr>
           <w:rFonts w:ascii="Times New Roman" w:hAnsi="Times New Roman" w:eastAsia="Times New Roman" w:cs="Times New Roman"/>
@@ -3241,22 +5143,25 @@
           <w:sz w:val="32"/>
           <w:szCs w:val="32"/>
           <w:highlight w:val="none"/>
-          <w:lang w:val="en-US"/>
           <w14:ligatures w14:val="none"/>
         </w:rPr>
       </w:r>
-      <w:r>
+    </w:p>
+    <w:p>
+      <w:pPr>
+        <w:pBdr/>
+        <w:spacing w:after="14" w:line="240" w:lineRule="auto"/>
+        <w:ind w:right="270"/>
+        <w:jc w:val="left"/>
         <w:rPr>
           <w:rFonts w:ascii="Times New Roman" w:hAnsi="Times New Roman" w:eastAsia="Times New Roman" w:cs="Times New Roman"/>
           <w:color w:val="000000"/>
           <w:sz w:val="32"/>
           <w:szCs w:val="32"/>
           <w:highlight w:val="none"/>
-          <w:lang w:val="en-US"/>
           <w14:ligatures w14:val="none"/>
         </w:rPr>
-        <w:t xml:space="preserve">1. Восстановление таблицы истинности</w:t>
-      </w:r>
+      </w:pPr>
       <w:r>
         <w:rPr>
           <w:rFonts w:ascii="Times New Roman" w:hAnsi="Times New Roman" w:eastAsia="Times New Roman" w:cs="Times New Roman"/>
@@ -3264,10 +5169,8 @@
           <w:sz w:val="32"/>
           <w:szCs w:val="32"/>
           <w:highlight w:val="none"/>
-          <w:lang w:val="en-US"/>
           <w14:ligatures w14:val="none"/>
         </w:rPr>
-        <w:t xml:space="preserve">:</w:t>
       </w:r>
       <w:r>
         <w:rPr>
@@ -3276,7 +5179,6 @@
           <w:sz w:val="32"/>
           <w:szCs w:val="32"/>
           <w:highlight w:val="none"/>
-          <w:lang w:val="en-US"/>
           <w14:ligatures w14:val="none"/>
         </w:rPr>
       </w:r>
@@ -3287,7 +5189,6 @@
           <w:sz w:val="32"/>
           <w:szCs w:val="32"/>
           <w:highlight w:val="none"/>
-          <w:lang w:val="en-US"/>
           <w14:ligatures w14:val="none"/>
         </w:rPr>
       </w:r>
@@ -3296,42 +5197,367 @@
       <w:pPr>
         <w:pBdr/>
         <w:spacing w:after="14" w:line="240" w:lineRule="auto"/>
-        <w:ind w:right="270" w:firstLine="0" w:left="0"/>
+        <w:ind w:right="270"/>
         <w:jc w:val="left"/>
+        <w:rPr>
+          <w:b/>
+          <w:bCs/>
+        </w:rPr>
+      </w:pPr>
+      <w:r>
+        <w:rPr>
+          <w:rFonts w:ascii="Times New Roman" w:hAnsi="Times New Roman" w:eastAsia="Times New Roman" w:cs="Times New Roman"/>
+          <w:b/>
+          <w:bCs/>
+          <w:color w:val="000000"/>
+          <w:sz w:val="28"/>
+          <w:szCs w:val="28"/>
+          <w:highlight w:val="none"/>
+          <w14:ligatures w14:val="none"/>
+        </w:rPr>
+        <w:t xml:space="preserve">Контрольные вопросы</w:t>
+      </w:r>
+      <w:r>
+        <w:rPr>
+          <w:b/>
+          <w:bCs/>
+        </w:rPr>
+      </w:r>
+      <w:r>
+        <w:rPr>
+          <w:rFonts w:ascii="Times New Roman" w:hAnsi="Times New Roman" w:eastAsia="Times New Roman" w:cs="Times New Roman"/>
+          <w:b/>
+          <w:bCs/>
+          <w:color w:val="000000"/>
+          <w:sz w:val="28"/>
+          <w:szCs w:val="28"/>
+          <w:highlight w:val="none"/>
+          <w14:ligatures w14:val="none"/>
+        </w:rPr>
+      </w:r>
+    </w:p>
+    <w:p>
+      <w:pPr>
+        <w:pStyle w:val="957"/>
+        <w:numPr>
+          <w:ilvl w:val="0"/>
+          <w:numId w:val="21"/>
+        </w:numPr>
+        <w:pBdr/>
+        <w:spacing w:after="14" w:line="240" w:lineRule="auto"/>
+        <w:ind w:right="270"/>
+        <w:jc w:val="left"/>
+        <w:rPr/>
+      </w:pPr>
+      <w:r>
         <w:rPr>
           <w:rFonts w:ascii="Times New Roman" w:hAnsi="Times New Roman" w:eastAsia="Times New Roman" w:cs="Times New Roman"/>
           <w:color w:val="000000"/>
           <w:sz w:val="28"/>
           <w:szCs w:val="28"/>
+          <w:highlight w:val="none"/>
           <w14:ligatures w14:val="none"/>
         </w:rPr>
-      </w:pPr>
+        <w:t xml:space="preserve">СДНФ строится для строк таблицы истинности, где функция равна 1, и представляет собой дизъюнкцию конъюнкций. СКНФ строится для строк, где функция равна 0, и представляет собой конъюнкцию дизъюнкций. В СДНФ переменные со значением 0 инвертируются, в СКНФ – п</w:t>
+      </w:r>
       <w:r>
+        <w:rPr>
+          <w:rFonts w:ascii="Times New Roman" w:hAnsi="Times New Roman" w:eastAsia="Times New Roman" w:cs="Times New Roman"/>
+          <w:color w:val="000000"/>
+          <w:sz w:val="28"/>
+          <w:szCs w:val="28"/>
+          <w:highlight w:val="none"/>
+          <w14:ligatures w14:val="none"/>
+        </w:rPr>
+        <w:t xml:space="preserve">еременные со значением 1</w:t>
+      </w:r>
+      <w:r>
+        <w:rPr>
+          <w:rFonts w:ascii="Times New Roman" w:hAnsi="Times New Roman" w:eastAsia="Times New Roman" w:cs="Times New Roman"/>
+          <w:color w:val="000000"/>
+          <w:sz w:val="28"/>
+          <w:szCs w:val="28"/>
+          <w:highlight w:val="none"/>
+          <w14:ligatures w14:val="none"/>
+        </w:rPr>
+      </w:r>
+      <w:r/>
+      <w:r>
+        <w:rPr>
+          <w:rFonts w:ascii="Times New Roman" w:hAnsi="Times New Roman" w:eastAsia="Times New Roman" w:cs="Times New Roman"/>
+          <w:color w:val="000000"/>
+          <w:sz w:val="28"/>
+          <w:szCs w:val="28"/>
+          <w:highlight w:val="none"/>
+          <w14:ligatures w14:val="none"/>
+        </w:rPr>
+      </w:r>
+    </w:p>
+    <w:p>
+      <w:pPr>
+        <w:pStyle w:val="957"/>
+        <w:numPr>
+          <w:ilvl w:val="0"/>
+          <w:numId w:val="21"/>
+        </w:numPr>
+        <w:pBdr/>
+        <w:spacing w:after="14" w:line="240" w:lineRule="auto"/>
+        <w:ind w:right="270"/>
+        <w:jc w:val="left"/>
+        <w:rPr/>
+      </w:pPr>
+      <w:r>
+        <w:rPr>
+          <w:rFonts w:ascii="Times New Roman" w:hAnsi="Times New Roman" w:eastAsia="Times New Roman" w:cs="Times New Roman"/>
+          <w:color w:val="000000"/>
+          <w:sz w:val="28"/>
+          <w:szCs w:val="28"/>
+          <w:highlight w:val="none"/>
+          <w14:ligatures w14:val="none"/>
+        </w:rPr>
+        <w:t xml:space="preserve">Нормальные формы обеспечивают стандартизированное представление логических функций, упрощают анализ и синтез цифровых схем, позволяют минимизировать количество логических элементов и облегчают верификацию корректности схем</w:t>
+      </w:r>
+      <w:r>
+        <w:rPr>
+          <w:rFonts w:ascii="Times New Roman" w:hAnsi="Times New Roman" w:eastAsia="Times New Roman" w:cs="Times New Roman"/>
+          <w:color w:val="000000"/>
+          <w:sz w:val="28"/>
+          <w:szCs w:val="28"/>
+          <w:highlight w:val="none"/>
+          <w14:ligatures w14:val="none"/>
+        </w:rPr>
+      </w:r>
+      <w:r/>
+      <w:r>
+        <w:rPr>
+          <w:rFonts w:ascii="Times New Roman" w:hAnsi="Times New Roman" w:eastAsia="Times New Roman" w:cs="Times New Roman"/>
+          <w:color w:val="000000"/>
+          <w:sz w:val="28"/>
+          <w:szCs w:val="28"/>
+          <w:highlight w:val="none"/>
+          <w14:ligatures w14:val="none"/>
+        </w:rPr>
+      </w:r>
+    </w:p>
+    <w:p>
+      <w:pPr>
+        <w:pStyle w:val="957"/>
+        <w:numPr>
+          <w:ilvl w:val="0"/>
+          <w:numId w:val="21"/>
+        </w:numPr>
+        <w:pBdr/>
+        <w:spacing w:after="14" w:line="240" w:lineRule="auto"/>
+        <w:ind w:right="270"/>
+        <w:jc w:val="left"/>
+        <w:rPr/>
+      </w:pPr>
+      <w:r>
+        <w:rPr>
+          <w:rFonts w:ascii="Times New Roman" w:hAnsi="Times New Roman" w:eastAsia="Times New Roman" w:cs="Times New Roman"/>
+          <w:color w:val="000000"/>
+          <w:sz w:val="28"/>
+          <w:szCs w:val="28"/>
+          <w:highlight w:val="none"/>
+          <w14:ligatures w14:val="none"/>
+        </w:rPr>
+        <w:t xml:space="preserve">СДНФ предпочтительнее, когда функция принимает значение 1 на меньшем числе комбинаций входов, что упрощает реализацию через ИЛИ-И логику. СКНФ предпочтительнее, когда функция принимает значение 0 на меньшем числе комбинаций, что упрощает реализацию через И-</w:t>
+      </w:r>
+      <w:r>
+        <w:rPr>
+          <w:rFonts w:ascii="Times New Roman" w:hAnsi="Times New Roman" w:eastAsia="Times New Roman" w:cs="Times New Roman"/>
+          <w:color w:val="000000"/>
+          <w:sz w:val="28"/>
+          <w:szCs w:val="28"/>
+          <w:highlight w:val="none"/>
+          <w14:ligatures w14:val="none"/>
+        </w:rPr>
+        <w:t xml:space="preserve">ИЛИ логику</w:t>
+      </w:r>
+      <w:r>
+        <w:rPr>
+          <w:rFonts w:ascii="Times New Roman" w:hAnsi="Times New Roman" w:eastAsia="Times New Roman" w:cs="Times New Roman"/>
+          <w:color w:val="000000"/>
+          <w:sz w:val="28"/>
+          <w:szCs w:val="28"/>
+          <w:highlight w:val="none"/>
+          <w14:ligatures w14:val="none"/>
+        </w:rPr>
+      </w:r>
+      <w:r/>
+      <w:r>
+        <w:rPr>
+          <w:rFonts w:ascii="Times New Roman" w:hAnsi="Times New Roman" w:eastAsia="Times New Roman" w:cs="Times New Roman"/>
+          <w:color w:val="000000"/>
+          <w:sz w:val="28"/>
+          <w:szCs w:val="28"/>
+          <w:highlight w:val="none"/>
+          <w14:ligatures w14:val="none"/>
+        </w:rPr>
+      </w:r>
+    </w:p>
+    <w:p>
+      <w:pPr>
+        <w:pStyle w:val="957"/>
+        <w:numPr>
+          <w:ilvl w:val="0"/>
+          <w:numId w:val="21"/>
+        </w:numPr>
+        <w:pBdr/>
+        <w:spacing w:after="14" w:line="240" w:lineRule="auto"/>
+        <w:ind w:right="270"/>
+        <w:jc w:val="left"/>
+        <w:rPr/>
+      </w:pPr>
+      <w:r>
+        <w:rPr>
+          <w:rFonts w:ascii="Times New Roman" w:hAnsi="Times New Roman" w:eastAsia="Times New Roman" w:cs="Times New Roman"/>
+          <w:color w:val="000000"/>
+          <w:sz w:val="28"/>
+          <w:szCs w:val="28"/>
+          <w:highlight w:val="none"/>
+          <w14:ligatures w14:val="none"/>
+        </w:rPr>
+        <w:t xml:space="preserve">В Excel функция И (AND) возвращает ИСТИНА, если все аргументы истинны (логическое И); ИЛИ (OR) возвращает ИСТИНА, если хотя бы один аргумент истинен (логическое ИЛИ); НЕ (NOT) инвертирует логическое значение аргумента (логическое НЕ)</w:t>
+      </w:r>
+      <w:r>
+        <w:rPr>
+          <w:rFonts w:ascii="Times New Roman" w:hAnsi="Times New Roman" w:eastAsia="Times New Roman" w:cs="Times New Roman"/>
+          <w:color w:val="000000"/>
+          <w:sz w:val="28"/>
+          <w:szCs w:val="28"/>
+          <w:highlight w:val="none"/>
+          <w14:ligatures w14:val="none"/>
+        </w:rPr>
+      </w:r>
+      <w:r/>
+      <w:r>
+        <w:rPr>
+          <w:rFonts w:ascii="Times New Roman" w:hAnsi="Times New Roman" w:eastAsia="Times New Roman" w:cs="Times New Roman"/>
+          <w:color w:val="000000"/>
+          <w:sz w:val="28"/>
+          <w:szCs w:val="28"/>
+          <w:highlight w:val="none"/>
+          <w14:ligatures w14:val="none"/>
+        </w:rPr>
+      </w:r>
+    </w:p>
+    <w:p>
+      <w:pPr>
+        <w:pStyle w:val="957"/>
+        <w:numPr>
+          <w:ilvl w:val="0"/>
+          <w:numId w:val="21"/>
+        </w:numPr>
+        <w:pBdr/>
+        <w:spacing w:after="14" w:line="240" w:lineRule="auto"/>
+        <w:ind w:right="270"/>
+        <w:jc w:val="left"/>
         <w:rPr>
           <w:rFonts w:ascii="Times New Roman" w:hAnsi="Times New Roman" w:eastAsia="Times New Roman" w:cs="Times New Roman"/>
           <w:color w:val="000000"/>
           <w:sz w:val="32"/>
           <w:szCs w:val="32"/>
           <w:highlight w:val="none"/>
-          <w:lang w:val="en-US"/>
           <w14:ligatures w14:val="none"/>
         </w:rPr>
-      </w:r>
+      </w:pPr>
       <w:r>
         <w:rPr>
           <w:rFonts w:ascii="Times New Roman" w:hAnsi="Times New Roman" w:eastAsia="Times New Roman" w:cs="Times New Roman"/>
           <w:color w:val="000000"/>
           <w:sz w:val="28"/>
           <w:szCs w:val="28"/>
+          <w:highlight w:val="none"/>
           <w14:ligatures w14:val="none"/>
         </w:rPr>
+        <w:t xml:space="preserve">Проверка таблицы истинности перед построением схем гарантирует правильность логической функции и позволяет выявить ошибки на этапе проектирования, до физической реализации схемы. Это экономит время и ресурсы, предотвращая производство неисправных устройств</w:t>
       </w:r>
+      <w:r/>
       <w:r>
         <w:rPr>
           <w:rFonts w:ascii="Times New Roman" w:hAnsi="Times New Roman" w:eastAsia="Times New Roman" w:cs="Times New Roman"/>
           <w:color w:val="000000"/>
           <w:sz w:val="28"/>
           <w:szCs w:val="28"/>
+          <w:highlight w:val="none"/>
+          <w14:ligatures w14:val="none"/>
+        </w:rPr>
+      </w:r>
+      <w:r>
+        <w:rPr>
+          <w:rFonts w:ascii="Times New Roman" w:hAnsi="Times New Roman" w:eastAsia="Times New Roman" w:cs="Times New Roman"/>
+          <w:color w:val="000000"/>
+          <w:sz w:val="28"/>
+          <w:szCs w:val="28"/>
+          <w:highlight w:val="none"/>
+          <w14:ligatures w14:val="none"/>
+        </w:rPr>
+      </w:r>
+      <w:r>
+        <w:rPr>
+          <w:rFonts w:ascii="Times New Roman" w:hAnsi="Times New Roman" w:eastAsia="Times New Roman" w:cs="Times New Roman"/>
+          <w:color w:val="000000"/>
+          <w:sz w:val="28"/>
+          <w:szCs w:val="28"/>
+          <w:highlight w:val="none"/>
+          <w14:ligatures w14:val="none"/>
+        </w:rPr>
+      </w:r>
+    </w:p>
+    <w:p>
+      <w:pPr>
+        <w:pBdr/>
+        <w:spacing w:after="14" w:line="240" w:lineRule="auto"/>
+        <w:ind w:right="270"/>
+        <w:jc w:val="left"/>
+        <w:rPr>
+          <w:rFonts w:ascii="Times New Roman" w:hAnsi="Times New Roman" w:eastAsia="Times New Roman" w:cs="Times New Roman"/>
+          <w:color w:val="000000"/>
+          <w:sz w:val="28"/>
+          <w:szCs w:val="28"/>
+          <w:highlight w:val="none"/>
+          <w14:ligatures w14:val="none"/>
+        </w:rPr>
+      </w:pPr>
+      <w:r>
+        <w:rPr>
+          <w:rFonts w:ascii="Times New Roman" w:hAnsi="Times New Roman" w:eastAsia="Times New Roman" w:cs="Times New Roman"/>
+          <w:color w:val="000000"/>
+          <w:sz w:val="28"/>
+          <w:szCs w:val="28"/>
+          <w:highlight w:val="none"/>
+          <w14:ligatures w14:val="none"/>
+        </w:rPr>
+      </w:r>
+      <w:r/>
+      <w:r>
+        <w:rPr>
+          <w:rFonts w:ascii="Times New Roman" w:hAnsi="Times New Roman" w:eastAsia="Times New Roman" w:cs="Times New Roman"/>
+          <w:color w:val="000000"/>
+          <w:sz w:val="28"/>
+          <w:szCs w:val="28"/>
+          <w:highlight w:val="none"/>
+          <w14:ligatures w14:val="none"/>
+        </w:rPr>
+      </w:r>
+      <w:r>
+        <w:rPr>
+          <w:rFonts w:ascii="Times New Roman" w:hAnsi="Times New Roman" w:eastAsia="Times New Roman" w:cs="Times New Roman"/>
+          <w:color w:val="000000"/>
+          <w:sz w:val="28"/>
+          <w:szCs w:val="28"/>
+          <w:highlight w:val="none"/>
+          <w14:ligatures w14:val="none"/>
+        </w:rPr>
+      </w:r>
+      <w:r>
+        <w:rPr>
+          <w:rFonts w:ascii="Times New Roman" w:hAnsi="Times New Roman" w:eastAsia="Times New Roman" w:cs="Times New Roman"/>
+          <w:color w:val="000000"/>
+          <w:sz w:val="28"/>
+          <w:szCs w:val="28"/>
+          <w:highlight w:val="none"/>
           <w14:ligatures w14:val="none"/>
         </w:rPr>
       </w:r>
@@ -4456,6 +6682,429 @@
       <w:rPr>
         <w:rFonts w:hint="default"/>
       </w:rPr>
+      <w:start w:val="1"/>
+      <w:suff w:val="tab"/>
+    </w:lvl>
+  </w:abstractNum>
+  <w:abstractNum w:abstractNumId="6">
+    <w:nsid w:val="1B4C7FC8"/>
+    <w:lvl w:ilvl="0">
+      <w:isLgl w:val="false"/>
+      <w:lvlJc w:val="left"/>
+      <w:lvlText w:val="·"/>
+      <w:numFmt w:val="bullet"/>
+      <w:pPr>
+        <w:pBdr/>
+        <w:spacing/>
+        <w:ind w:hanging="360" w:left="720"/>
+      </w:pPr>
+      <w:rPr>
+        <w:rFonts w:hint="default" w:ascii="Symbol" w:hAnsi="Symbol" w:eastAsia="Symbol" w:cs="Symbol"/>
+      </w:rPr>
+      <w:start w:val="1"/>
+      <w:suff w:val="tab"/>
+    </w:lvl>
+    <w:lvl w:ilvl="1">
+      <w:isLgl w:val="false"/>
+      <w:lvlJc w:val="left"/>
+      <w:lvlText w:val="o"/>
+      <w:numFmt w:val="bullet"/>
+      <w:pPr>
+        <w:pBdr/>
+        <w:spacing/>
+        <w:ind w:hanging="360" w:left="1440"/>
+      </w:pPr>
+      <w:rPr>
+        <w:rFonts w:hint="default" w:ascii="Courier New" w:hAnsi="Courier New" w:eastAsia="Courier New" w:cs="Courier New"/>
+      </w:rPr>
+      <w:start w:val="1"/>
+      <w:suff w:val="tab"/>
+    </w:lvl>
+    <w:lvl w:ilvl="2">
+      <w:isLgl w:val="false"/>
+      <w:lvlJc w:val="left"/>
+      <w:lvlText w:val="§"/>
+      <w:numFmt w:val="bullet"/>
+      <w:pPr>
+        <w:pBdr/>
+        <w:spacing/>
+        <w:ind w:hanging="360" w:left="2160"/>
+      </w:pPr>
+      <w:rPr>
+        <w:rFonts w:hint="default" w:ascii="Wingdings" w:hAnsi="Wingdings" w:eastAsia="Wingdings" w:cs="Wingdings"/>
+      </w:rPr>
+      <w:start w:val="1"/>
+      <w:suff w:val="tab"/>
+    </w:lvl>
+    <w:lvl w:ilvl="3">
+      <w:isLgl w:val="false"/>
+      <w:lvlJc w:val="left"/>
+      <w:lvlText w:val="·"/>
+      <w:numFmt w:val="bullet"/>
+      <w:pPr>
+        <w:pBdr/>
+        <w:spacing/>
+        <w:ind w:hanging="360" w:left="2880"/>
+      </w:pPr>
+      <w:rPr>
+        <w:rFonts w:hint="default" w:ascii="Symbol" w:hAnsi="Symbol" w:eastAsia="Symbol" w:cs="Symbol"/>
+      </w:rPr>
+      <w:start w:val="1"/>
+      <w:suff w:val="tab"/>
+    </w:lvl>
+    <w:lvl w:ilvl="4">
+      <w:isLgl w:val="false"/>
+      <w:lvlJc w:val="left"/>
+      <w:lvlText w:val="o"/>
+      <w:numFmt w:val="bullet"/>
+      <w:pPr>
+        <w:pBdr/>
+        <w:spacing/>
+        <w:ind w:hanging="360" w:left="3600"/>
+      </w:pPr>
+      <w:rPr>
+        <w:rFonts w:hint="default" w:ascii="Courier New" w:hAnsi="Courier New" w:eastAsia="Courier New" w:cs="Courier New"/>
+      </w:rPr>
+      <w:start w:val="1"/>
+      <w:suff w:val="tab"/>
+    </w:lvl>
+    <w:lvl w:ilvl="5">
+      <w:isLgl w:val="false"/>
+      <w:lvlJc w:val="left"/>
+      <w:lvlText w:val="§"/>
+      <w:numFmt w:val="bullet"/>
+      <w:pPr>
+        <w:pBdr/>
+        <w:spacing/>
+        <w:ind w:hanging="360" w:left="4320"/>
+      </w:pPr>
+      <w:rPr>
+        <w:rFonts w:hint="default" w:ascii="Wingdings" w:hAnsi="Wingdings" w:eastAsia="Wingdings" w:cs="Wingdings"/>
+      </w:rPr>
+      <w:start w:val="1"/>
+      <w:suff w:val="tab"/>
+    </w:lvl>
+    <w:lvl w:ilvl="6">
+      <w:isLgl w:val="false"/>
+      <w:lvlJc w:val="left"/>
+      <w:lvlText w:val="·"/>
+      <w:numFmt w:val="bullet"/>
+      <w:pPr>
+        <w:pBdr/>
+        <w:spacing/>
+        <w:ind w:hanging="360" w:left="5040"/>
+      </w:pPr>
+      <w:rPr>
+        <w:rFonts w:hint="default" w:ascii="Symbol" w:hAnsi="Symbol" w:eastAsia="Symbol" w:cs="Symbol"/>
+      </w:rPr>
+      <w:start w:val="1"/>
+      <w:suff w:val="tab"/>
+    </w:lvl>
+    <w:lvl w:ilvl="7">
+      <w:isLgl w:val="false"/>
+      <w:lvlJc w:val="left"/>
+      <w:lvlText w:val="o"/>
+      <w:numFmt w:val="bullet"/>
+      <w:pPr>
+        <w:pBdr/>
+        <w:spacing/>
+        <w:ind w:hanging="360" w:left="5760"/>
+      </w:pPr>
+      <w:rPr>
+        <w:rFonts w:hint="default" w:ascii="Courier New" w:hAnsi="Courier New" w:eastAsia="Courier New" w:cs="Courier New"/>
+      </w:rPr>
+      <w:start w:val="1"/>
+      <w:suff w:val="tab"/>
+    </w:lvl>
+    <w:lvl w:ilvl="8">
+      <w:isLgl w:val="false"/>
+      <w:lvlJc w:val="left"/>
+      <w:lvlText w:val="§"/>
+      <w:numFmt w:val="bullet"/>
+      <w:pPr>
+        <w:pBdr/>
+        <w:spacing/>
+        <w:ind w:hanging="360" w:left="6480"/>
+      </w:pPr>
+      <w:rPr>
+        <w:rFonts w:hint="default" w:ascii="Wingdings" w:hAnsi="Wingdings" w:eastAsia="Wingdings" w:cs="Wingdings"/>
+      </w:rPr>
+      <w:start w:val="1"/>
+      <w:suff w:val="tab"/>
+    </w:lvl>
+  </w:abstractNum>
+  <w:abstractNum w:abstractNumId="7">
+    <w:nsid w:val="41763788"/>
+    <w:lvl w:ilvl="0">
+      <w:isLgl w:val="false"/>
+      <w:lvlJc w:val="left"/>
+      <w:lvlText w:val="·"/>
+      <w:numFmt w:val="bullet"/>
+      <w:pPr>
+        <w:pBdr/>
+        <w:spacing/>
+        <w:ind w:hanging="360" w:left="720"/>
+      </w:pPr>
+      <w:rPr>
+        <w:rFonts w:hint="default" w:ascii="Symbol" w:hAnsi="Symbol" w:eastAsia="Symbol" w:cs="Symbol"/>
+      </w:rPr>
+      <w:start w:val="1"/>
+      <w:suff w:val="tab"/>
+    </w:lvl>
+    <w:lvl w:ilvl="1">
+      <w:isLgl w:val="false"/>
+      <w:lvlJc w:val="left"/>
+      <w:lvlText w:val="o"/>
+      <w:numFmt w:val="bullet"/>
+      <w:pPr>
+        <w:pBdr/>
+        <w:spacing/>
+        <w:ind w:hanging="360" w:left="1440"/>
+      </w:pPr>
+      <w:rPr>
+        <w:rFonts w:hint="default" w:ascii="Courier New" w:hAnsi="Courier New" w:eastAsia="Courier New" w:cs="Courier New"/>
+      </w:rPr>
+      <w:start w:val="1"/>
+      <w:suff w:val="tab"/>
+    </w:lvl>
+    <w:lvl w:ilvl="2">
+      <w:isLgl w:val="false"/>
+      <w:lvlJc w:val="left"/>
+      <w:lvlText w:val="§"/>
+      <w:numFmt w:val="bullet"/>
+      <w:pPr>
+        <w:pBdr/>
+        <w:spacing/>
+        <w:ind w:hanging="360" w:left="2160"/>
+      </w:pPr>
+      <w:rPr>
+        <w:rFonts w:hint="default" w:ascii="Wingdings" w:hAnsi="Wingdings" w:eastAsia="Wingdings" w:cs="Wingdings"/>
+      </w:rPr>
+      <w:start w:val="1"/>
+      <w:suff w:val="tab"/>
+    </w:lvl>
+    <w:lvl w:ilvl="3">
+      <w:isLgl w:val="false"/>
+      <w:lvlJc w:val="left"/>
+      <w:lvlText w:val="·"/>
+      <w:numFmt w:val="bullet"/>
+      <w:pPr>
+        <w:pBdr/>
+        <w:spacing/>
+        <w:ind w:hanging="360" w:left="2880"/>
+      </w:pPr>
+      <w:rPr>
+        <w:rFonts w:hint="default" w:ascii="Symbol" w:hAnsi="Symbol" w:eastAsia="Symbol" w:cs="Symbol"/>
+      </w:rPr>
+      <w:start w:val="1"/>
+      <w:suff w:val="tab"/>
+    </w:lvl>
+    <w:lvl w:ilvl="4">
+      <w:isLgl w:val="false"/>
+      <w:lvlJc w:val="left"/>
+      <w:lvlText w:val="o"/>
+      <w:numFmt w:val="bullet"/>
+      <w:pPr>
+        <w:pBdr/>
+        <w:spacing/>
+        <w:ind w:hanging="360" w:left="3600"/>
+      </w:pPr>
+      <w:rPr>
+        <w:rFonts w:hint="default" w:ascii="Courier New" w:hAnsi="Courier New" w:eastAsia="Courier New" w:cs="Courier New"/>
+      </w:rPr>
+      <w:start w:val="1"/>
+      <w:suff w:val="tab"/>
+    </w:lvl>
+    <w:lvl w:ilvl="5">
+      <w:isLgl w:val="false"/>
+      <w:lvlJc w:val="left"/>
+      <w:lvlText w:val="§"/>
+      <w:numFmt w:val="bullet"/>
+      <w:pPr>
+        <w:pBdr/>
+        <w:spacing/>
+        <w:ind w:hanging="360" w:left="4320"/>
+      </w:pPr>
+      <w:rPr>
+        <w:rFonts w:hint="default" w:ascii="Wingdings" w:hAnsi="Wingdings" w:eastAsia="Wingdings" w:cs="Wingdings"/>
+      </w:rPr>
+      <w:start w:val="1"/>
+      <w:suff w:val="tab"/>
+    </w:lvl>
+    <w:lvl w:ilvl="6">
+      <w:isLgl w:val="false"/>
+      <w:lvlJc w:val="left"/>
+      <w:lvlText w:val="·"/>
+      <w:numFmt w:val="bullet"/>
+      <w:pPr>
+        <w:pBdr/>
+        <w:spacing/>
+        <w:ind w:hanging="360" w:left="5040"/>
+      </w:pPr>
+      <w:rPr>
+        <w:rFonts w:hint="default" w:ascii="Symbol" w:hAnsi="Symbol" w:eastAsia="Symbol" w:cs="Symbol"/>
+      </w:rPr>
+      <w:start w:val="1"/>
+      <w:suff w:val="tab"/>
+    </w:lvl>
+    <w:lvl w:ilvl="7">
+      <w:isLgl w:val="false"/>
+      <w:lvlJc w:val="left"/>
+      <w:lvlText w:val="o"/>
+      <w:numFmt w:val="bullet"/>
+      <w:pPr>
+        <w:pBdr/>
+        <w:spacing/>
+        <w:ind w:hanging="360" w:left="5760"/>
+      </w:pPr>
+      <w:rPr>
+        <w:rFonts w:hint="default" w:ascii="Courier New" w:hAnsi="Courier New" w:eastAsia="Courier New" w:cs="Courier New"/>
+      </w:rPr>
+      <w:start w:val="1"/>
+      <w:suff w:val="tab"/>
+    </w:lvl>
+    <w:lvl w:ilvl="8">
+      <w:isLgl w:val="false"/>
+      <w:lvlJc w:val="left"/>
+      <w:lvlText w:val="§"/>
+      <w:numFmt w:val="bullet"/>
+      <w:pPr>
+        <w:pBdr/>
+        <w:spacing/>
+        <w:ind w:hanging="360" w:left="6480"/>
+      </w:pPr>
+      <w:rPr>
+        <w:rFonts w:hint="default" w:ascii="Wingdings" w:hAnsi="Wingdings" w:eastAsia="Wingdings" w:cs="Wingdings"/>
+      </w:rPr>
+      <w:start w:val="1"/>
+      <w:suff w:val="tab"/>
+    </w:lvl>
+  </w:abstractNum>
+  <w:abstractNum w:abstractNumId="8">
+    <w:nsid w:val="46B95BD1"/>
+    <w:lvl w:ilvl="0">
+      <w:isLgl w:val="false"/>
+      <w:lvlJc w:val="left"/>
+      <w:lvlText w:val="%1."/>
+      <w:numFmt w:val="decimal"/>
+      <w:pPr>
+        <w:pBdr/>
+        <w:spacing/>
+        <w:ind w:hanging="360" w:left="720"/>
+      </w:pPr>
+      <w:rPr/>
+      <w:start w:val="1"/>
+      <w:suff w:val="tab"/>
+    </w:lvl>
+    <w:lvl w:ilvl="1">
+      <w:isLgl w:val="false"/>
+      <w:lvlJc w:val="left"/>
+      <w:lvlText w:val="%2."/>
+      <w:numFmt w:val="lowerLetter"/>
+      <w:pPr>
+        <w:pBdr/>
+        <w:spacing/>
+        <w:ind w:hanging="360" w:left="1440"/>
+      </w:pPr>
+      <w:rPr/>
+      <w:start w:val="1"/>
+      <w:suff w:val="tab"/>
+    </w:lvl>
+    <w:lvl w:ilvl="2">
+      <w:isLgl w:val="false"/>
+      <w:lvlJc w:val="right"/>
+      <w:lvlText w:val="%3."/>
+      <w:numFmt w:val="lowerRoman"/>
+      <w:pPr>
+        <w:pBdr/>
+        <w:spacing/>
+        <w:ind w:hanging="180" w:left="2160"/>
+      </w:pPr>
+      <w:rPr/>
+      <w:start w:val="1"/>
+      <w:suff w:val="tab"/>
+    </w:lvl>
+    <w:lvl w:ilvl="3">
+      <w:isLgl w:val="false"/>
+      <w:lvlJc w:val="left"/>
+      <w:lvlText w:val="%4."/>
+      <w:numFmt w:val="decimal"/>
+      <w:pPr>
+        <w:pBdr/>
+        <w:spacing/>
+        <w:ind w:hanging="360" w:left="2880"/>
+      </w:pPr>
+      <w:rPr/>
+      <w:start w:val="1"/>
+      <w:suff w:val="tab"/>
+    </w:lvl>
+    <w:lvl w:ilvl="4">
+      <w:isLgl w:val="false"/>
+      <w:lvlJc w:val="left"/>
+      <w:lvlText w:val="%5."/>
+      <w:numFmt w:val="lowerLetter"/>
+      <w:pPr>
+        <w:pBdr/>
+        <w:spacing/>
+        <w:ind w:hanging="360" w:left="3600"/>
+      </w:pPr>
+      <w:rPr/>
+      <w:start w:val="1"/>
+      <w:suff w:val="tab"/>
+    </w:lvl>
+    <w:lvl w:ilvl="5">
+      <w:isLgl w:val="false"/>
+      <w:lvlJc w:val="right"/>
+      <w:lvlText w:val="%6."/>
+      <w:numFmt w:val="lowerRoman"/>
+      <w:pPr>
+        <w:pBdr/>
+        <w:spacing/>
+        <w:ind w:hanging="180" w:left="4320"/>
+      </w:pPr>
+      <w:rPr/>
+      <w:start w:val="1"/>
+      <w:suff w:val="tab"/>
+    </w:lvl>
+    <w:lvl w:ilvl="6">
+      <w:isLgl w:val="false"/>
+      <w:lvlJc w:val="left"/>
+      <w:lvlText w:val="%7."/>
+      <w:numFmt w:val="decimal"/>
+      <w:pPr>
+        <w:pBdr/>
+        <w:spacing/>
+        <w:ind w:hanging="360" w:left="5040"/>
+      </w:pPr>
+      <w:rPr/>
+      <w:start w:val="1"/>
+      <w:suff w:val="tab"/>
+    </w:lvl>
+    <w:lvl w:ilvl="7">
+      <w:isLgl w:val="false"/>
+      <w:lvlJc w:val="left"/>
+      <w:lvlText w:val="%8."/>
+      <w:numFmt w:val="lowerLetter"/>
+      <w:pPr>
+        <w:pBdr/>
+        <w:spacing/>
+        <w:ind w:hanging="360" w:left="5760"/>
+      </w:pPr>
+      <w:rPr/>
+      <w:start w:val="1"/>
+      <w:suff w:val="tab"/>
+    </w:lvl>
+    <w:lvl w:ilvl="8">
+      <w:isLgl w:val="false"/>
+      <w:lvlJc w:val="right"/>
+      <w:lvlText w:val="%9."/>
+      <w:numFmt w:val="lowerRoman"/>
+      <w:pPr>
+        <w:pBdr/>
+        <w:spacing/>
+        <w:ind w:hanging="180" w:left="6480"/>
+      </w:pPr>
+      <w:rPr/>
       <w:start w:val="1"/>
       <w:suff w:val="tab"/>
     </w:lvl>
@@ -4648,6 +7297,15 @@
     <w:lvlOverride w:ilvl="8">
       <w:startOverride w:val="1"/>
     </w:lvlOverride>
+  </w:num>
+  <w:num w:numId="19">
+    <w:abstractNumId w:val="6"/>
+  </w:num>
+  <w:num w:numId="20">
+    <w:abstractNumId w:val="7"/>
+  </w:num>
+  <w:num w:numId="21">
+    <w:abstractNumId w:val="8"/>
   </w:num>
 </w:numbering>
 </file>

</xml_diff>